<commit_message>
Docs: actualizar documentación técnica v2.0, manual v1.1 e informe de pruebas (30 casos)
</commit_message>
<xml_diff>
--- a/Documentacion_Tecnica_Requintu.docx
+++ b/Documentacion_Tecnica_Requintu.docx
@@ -4,8 +4,7 @@
   <w:body>
     <w:sectPr>
       <w:pgSz w:w="12240" w:h="15840" w:orient="portrait"/>
-      <w:pgMar w:top="900" w:right="800" w:bottom="900" w:left="800" w:header="undefined" w:footer="undefined" w:gutter="undefined"/>
-      <w:footerReference r:id="rId6" w:type="default"/>
+      <w:pgMar w:top="720" w:right="720" w:bottom="720" w:left="720" w:header="undefined" w:footer="undefined" w:gutter="undefined"/>
     </w:sectPr>
     <w:p>
       <w:pPr>
@@ -91,6 +90,23 @@
       </w:pPr>
       <w:r>
         <w:rPr/>
+        <w:t xml:space="preserve">     Tiempo real: Server-Sent Events — Correo: Brevo (cola con reintentos)</w:t>
+      </w:r>
+    </w:p>
+    <w:p>
+      <w:pPr>
+        <w:spacing w:lineRule="auto"/>
+      </w:pPr>
+      <w:r>
+        <w:rPr/>
+      </w:r>
+    </w:p>
+    <w:p>
+      <w:pPr>
+        <w:spacing w:lineRule="auto"/>
+      </w:pPr>
+      <w:r>
+        <w:rPr/>
         <w:t xml:space="preserve">     Repositorio: github.com/aycardy93-eng/-requintu   </w:t>
       </w:r>
     </w:p>
@@ -100,7 +116,7 @@
       </w:pPr>
       <w:r>
         <w:rPr/>
-        <w:t xml:space="preserve">Versión 1.0 — 28 de agosto de 2026</w:t>
+        <w:t xml:space="preserve">Versión 2.0 — 28 de agosto de 2026</w:t>
       </w:r>
     </w:p>
     <w:p>
@@ -135,7 +151,17 @@
       </w:r>
       <w:r>
         <w:rPr/>
-        <w:t xml:space="preserve"> dividido por departamentos y municipios, consultar el detalle de cada negocio (fotos, promociones, calificaciones, ubicación), publicar contenido en un muro comunitario y, en el caso de los comerciantes, crear y administrar sus propios locales. Una cuenta de administrador permite gestionar usuarios, locales y publicaciones en un panel dedicado.</w:t>
+        <w:t xml:space="preserve"> dividido por departamentos y municipios, consultar el detalle de cada negocio (fotos, promociones, calificaciones, ubicación), publicar contenido en un </w:t>
+      </w:r>
+      <w:r>
+        <w:rPr>
+          <w:b/>
+        </w:rPr>
+        <w:t xml:space="preserve">muro comunitario con avisos en tiempo real</w:t>
+      </w:r>
+      <w:r>
+        <w:rPr/>
+        <w:t xml:space="preserve"> y, en el caso de los comerciantes, crear y administrar sus propios locales. Una cuenta de administrador permite gestionar usuarios, locales y publicaciones en un panel dedicado.</w:t>
       </w:r>
     </w:p>
     <w:p>
@@ -182,7 +208,7 @@
       </w:r>
       <w:r>
         <w:rPr/>
-        <w:t xml:space="preserve"> (Capacitor 8) que empaqueta el mismo frontend.</w:t>
+        <w:t xml:space="preserve"> (Capacitor 8) que empaqueta el mismo frontend (firmada en release para Google Play).</w:t>
       </w:r>
     </w:p>
     <w:p>
@@ -230,7 +256,17 @@
       </w:r>
       <w:r>
         <w:rPr/>
-        <w:t xml:space="preserve"> con API REST y autenticación por tokens JWT:</w:t>
+        <w:t xml:space="preserve"> con API REST y autenticación por tokens JWT, más un canal </w:t>
+      </w:r>
+      <w:r>
+        <w:rPr>
+          <w:b/>
+        </w:rPr>
+        <w:t xml:space="preserve">Server-Sent Events (SSE)</w:t>
+      </w:r>
+      <w:r>
+        <w:rPr/>
+        <w:t xml:space="preserve"> para avisar en vivo de las novedades del muro:</w:t>
       </w:r>
     </w:p>
     <w:p>
@@ -241,7 +277,7 @@
         <w:rPr>
           <w:rFonts w:ascii="Courier" w:hAnsi="Courier"/>
         </w:rPr>
-        <w:t xml:space="preserve">   +-----------------------------+          +--------------------------+   |  Web (React + Vite)         |          |  App nativa (Capacitor)  |   |  requintu.vercel.app        |          |  Android (.apk)          |   +--------------+--------------+          +------------+-------------+                  |                                       |                  |  HTTPS / CORS            (mismo frontend web)                  +--------------+-----------------------+                                 |                        +--------v---------+                        |  Backend API     |                        |  Node + Express  |                        |  requintu-1.onrender.com |                        +--------+---------+                                 |               +-----------------+------------------+               |                |                  |       +-------v------+  +-----v------+   +-------v---------+       |  MySQL / TiDB|  | Cloudinary |   | Brevo (correo)  |       |  Cloud (aaS) |  | (imágenes) |   | (transaccional) |       +--------------+  +------------+   +-----------------+ </w:t>
+        <w:t xml:space="preserve">   +-----------------------------+          +--------------------------+   |  Web (React + Vite)         |          |  App nativa (Capacitor)  |   |  requintu.vercel.app        |          |  Android (.apk)          |   +--------------+--------------+          +------------+-------------+                  |                                       |                  |  HTTPS / CORS            (mismo frontend web)                  +--------------+-----------------------+                                 |                        +--------v---------+                        |  Backend API     |                        |  Node + Express  |                        |  requintu-1.onrender.com |                        +--------+---------+                         |                |               SSE (GET /api/eventos)     |                  (avisos del muro)       |                                 |                +-----------------+------------------+                |                |                  |        +-------v------+  +-----v------+   +-------v---------+        |  MySQL / TiDB|  | Cloudinary |   | Brevo (correo)  |        |  Cloud (aaS) |  | (imágenes) |   | cola + reintentos|        +--------------+  +------------+   +-----------------+ </w:t>
       </w:r>
     </w:p>
     <w:p>
@@ -260,7 +296,23 @@
       </w:r>
       <w:r>
         <w:rPr/>
-        <w:t xml:space="preserve">: React 19 con React Router 7 (SPA). Compilado con Vite 8; se sirve como estático en Vercel con rewrites SPA.</w:t>
+        <w:t xml:space="preserve">: React 19 con React Router 7 (SPA). Compilado con Vite 8; se sirve como estático en Vercel con rewrites SPA (configuración en </w:t>
+      </w:r>
+      <w:r>
+        <w:rPr/>
+        <w:t xml:space="preserve">frontend/vercel.json</w:t>
+      </w:r>
+      <w:r>
+        <w:rPr/>
+        <w:t xml:space="preserve">, Root Directory </w:t>
+      </w:r>
+      <w:r>
+        <w:rPr/>
+        <w:t xml:space="preserve">frontend</w:t>
+      </w:r>
+      <w:r>
+        <w:rPr/>
+        <w:t xml:space="preserve">).</w:t>
       </w:r>
     </w:p>
     <w:p>
@@ -295,7 +347,7 @@
       </w:r>
       <w:r>
         <w:rPr/>
-        <w:t xml:space="preserve">.</w:t>
+        <w:t xml:space="preserve">. Firmada en release (keystore propio) para Google Play.</w:t>
       </w:r>
     </w:p>
     <w:p>
@@ -330,7 +382,7 @@
       </w:r>
       <w:r>
         <w:rPr/>
-        <w:t xml:space="preserve"> y aplica seguridad (helmet, rate limit, CORS, HTTPS).</w:t>
+        <w:t xml:space="preserve"> y aplica seguridad (helmet, rate limit, CORS, HTTPS). Incluye un canal SSE y una cola de correos persistida.</w:t>
       </w:r>
     </w:p>
     <w:p>
@@ -376,7 +428,7 @@
       </w:r>
       <w:r>
         <w:rPr/>
-        <w:t xml:space="preserve">: las imágenes se suben al backend con Multer y se publican en Cloudinary.</w:t>
+        <w:t xml:space="preserve">: las imágenes se suben al backend con Multer (con validación de formato real) y se publican en Cloudinary.</w:t>
       </w:r>
     </w:p>
     <w:p>
@@ -395,7 +447,64 @@
       </w:r>
       <w:r>
         <w:rPr/>
-        <w:t xml:space="preserve">: la recuperación de contraseña usa la API v3 de Brevo (SMTP por HTTP).</w:t>
+        <w:t xml:space="preserve">: la recuperación de contraseña se encola (tabla </w:t>
+      </w:r>
+      <w:r>
+        <w:rPr/>
+        <w:t xml:space="preserve">cola_emails</w:t>
+      </w:r>
+      <w:r>
+        <w:rPr/>
+        <w:t xml:space="preserve">) y se envía con la API v3 de Brevo, con reintentos y backoff.</w:t>
+      </w:r>
+    </w:p>
+    <w:p>
+      <w:pPr>
+        <w:numPr>
+          <w:ilvl w:val="0"/>
+          <w:numId w:val="2"/>
+        </w:numPr>
+        <w:spacing w:lineRule="auto"/>
+      </w:pPr>
+      <w:r>
+        <w:rPr>
+          <w:b/>
+        </w:rPr>
+        <w:t xml:space="preserve">Tiempo real</w:t>
+      </w:r>
+      <w:r>
+        <w:rPr/>
+        <w:t xml:space="preserve">: el muro de publicaciones recibe eventos </w:t>
+      </w:r>
+      <w:r>
+        <w:rPr>
+          <w:i/>
+        </w:rPr>
+        <w:t xml:space="preserve">nueva</w:t>
+      </w:r>
+      <w:r>
+        <w:rPr/>
+        <w:t xml:space="preserve">, </w:t>
+      </w:r>
+      <w:r>
+        <w:rPr>
+          <w:i/>
+        </w:rPr>
+        <w:t xml:space="preserve">editada</w:t>
+      </w:r>
+      <w:r>
+        <w:rPr/>
+        <w:t xml:space="preserve"> y </w:t>
+      </w:r>
+      <w:r>
+        <w:rPr>
+          <w:i/>
+        </w:rPr>
+        <w:t xml:space="preserve">borrada</w:t>
+      </w:r>
+      <w:r>
+        <w:rPr/>
+        <w:t xml:space="preserve"> por SSE sin dependencias externas.</w:t>
       </w:r>
     </w:p>
     <w:p>
@@ -436,8 +545,8 @@
         <w:jc w:val="center"/>
       </w:tblPr>
       <w:tblGrid>
-        <w:gridCol w:w="5320"/>
-        <w:gridCol w:w="5320"/>
+        <w:gridCol w:w="5400"/>
+        <w:gridCol w:w="5400"/>
       </w:tblGrid>
       <w:tr>
         <w:trPr>
@@ -789,7 +898,7 @@
             </w:pPr>
             <w:r>
               <w:rPr/>
-              <w:t xml:space="preserve">Recepción de archivos (solo imágenes JPEG/PNG/WebP, máx. 5 MB).</w:t>
+              <w:t xml:space="preserve">Recepción de archivos (solo imágenes JPEG/PNG/WebP, máx. 5 MB, validados por contenido).</w:t>
             </w:r>
           </w:p>
         </w:tc>
@@ -1005,6 +1114,128 @@
             <w:r>
               <w:rPr/>
               <w:t xml:space="preserve">Lista blanca de orígenes (web + Capacitor).</w:t>
+            </w:r>
+          </w:p>
+        </w:tc>
+      </w:tr>
+      <w:tr>
+        <w:trPr>
+          <w:cantSplit/>
+        </w:trPr>
+        <w:tc>
+          <w:tcPr>
+            <w:tcBorders>
+              <w:top w:val="single" w:sz="1" w:space="0" w:color="000000"/>
+              <w:bottom w:val="single" w:sz="1" w:space="0" w:color="000000"/>
+              <w:left w:val="single" w:sz="1" w:space="0" w:color="000000"/>
+              <w:right w:val="single" w:sz="1" w:space="0" w:color="000000"/>
+            </w:tcBorders>
+          </w:tcPr>
+          <w:p>
+            <w:pPr>
+              <w:spacing w:lineRule="auto"/>
+            </w:pPr>
+            <w:r>
+              <w:rPr/>
+              <w:t xml:space="preserve">Server-Sent Events (nativo)</w:t>
+            </w:r>
+          </w:p>
+        </w:tc>
+        <w:tc>
+          <w:tcPr>
+            <w:tcBorders>
+              <w:top w:val="single" w:sz="1" w:space="0" w:color="000000"/>
+              <w:bottom w:val="single" w:sz="1" w:space="0" w:color="000000"/>
+              <w:left w:val="single" w:sz="1" w:space="0" w:color="000000"/>
+              <w:right w:val="single" w:sz="1" w:space="0" w:color="000000"/>
+            </w:tcBorders>
+          </w:tcPr>
+          <w:p>
+            <w:pPr>
+              <w:spacing w:lineRule="auto"/>
+            </w:pPr>
+            <w:r>
+              <w:rPr/>
+              <w:t xml:space="preserve">Canal </w:t>
+            </w:r>
+          </w:p>
+          <w:p>
+            <w:pPr>
+              <w:spacing w:lineRule="auto"/>
+            </w:pPr>
+            <w:r>
+              <w:rPr/>
+              <w:t xml:space="preserve">GET /api/eventos</w:t>
+            </w:r>
+          </w:p>
+          <w:p>
+            <w:pPr>
+              <w:spacing w:lineRule="auto"/>
+            </w:pPr>
+            <w:r>
+              <w:rPr/>
+              <w:t xml:space="preserve"> para avisos del muro (sin dependencias).</w:t>
+            </w:r>
+          </w:p>
+        </w:tc>
+      </w:tr>
+      <w:tr>
+        <w:trPr>
+          <w:cantSplit/>
+        </w:trPr>
+        <w:tc>
+          <w:tcPr>
+            <w:tcBorders>
+              <w:top w:val="single" w:sz="1" w:space="0" w:color="000000"/>
+              <w:bottom w:val="single" w:sz="1" w:space="0" w:color="000000"/>
+              <w:left w:val="single" w:sz="1" w:space="0" w:color="000000"/>
+              <w:right w:val="single" w:sz="1" w:space="0" w:color="000000"/>
+            </w:tcBorders>
+          </w:tcPr>
+          <w:p>
+            <w:pPr>
+              <w:spacing w:lineRule="auto"/>
+            </w:pPr>
+            <w:r>
+              <w:rPr/>
+              <w:t xml:space="preserve">node:test</w:t>
+            </w:r>
+          </w:p>
+        </w:tc>
+        <w:tc>
+          <w:tcPr>
+            <w:tcBorders>
+              <w:top w:val="single" w:sz="1" w:space="0" w:color="000000"/>
+              <w:bottom w:val="single" w:sz="1" w:space="0" w:color="000000"/>
+              <w:left w:val="single" w:sz="1" w:space="0" w:color="000000"/>
+              <w:right w:val="single" w:sz="1" w:space="0" w:color="000000"/>
+            </w:tcBorders>
+          </w:tcPr>
+          <w:p>
+            <w:pPr>
+              <w:spacing w:lineRule="auto"/>
+            </w:pPr>
+            <w:r>
+              <w:rPr/>
+              <w:t xml:space="preserve">Suite de pruebas de integración (</w:t>
+            </w:r>
+          </w:p>
+          <w:p>
+            <w:pPr>
+              <w:spacing w:lineRule="auto"/>
+            </w:pPr>
+            <w:r>
+              <w:rPr/>
+              <w:t xml:space="preserve">npm test</w:t>
+            </w:r>
+          </w:p>
+          <w:p>
+            <w:pPr>
+              <w:spacing w:lineRule="auto"/>
+            </w:pPr>
+            <w:r>
+              <w:rPr/>
+              <w:t xml:space="preserve">, 21 pruebas).</w:t>
             </w:r>
           </w:p>
         </w:tc>
@@ -1097,8 +1328,8 @@
         <w:jc w:val="center"/>
       </w:tblPr>
       <w:tblGrid>
-        <w:gridCol w:w="5320"/>
-        <w:gridCol w:w="5320"/>
+        <w:gridCol w:w="5400"/>
+        <w:gridCol w:w="5400"/>
       </w:tblGrid>
       <w:tr>
         <w:trPr>
@@ -1291,26 +1522,26 @@
             </w:pPr>
             <w:r>
               <w:rPr/>
-              <w:t xml:space="preserve">swiper</w:t>
-            </w:r>
-          </w:p>
-        </w:tc>
-        <w:tc>
-          <w:tcPr>
-            <w:tcBorders>
-              <w:top w:val="single" w:sz="1" w:space="0" w:color="000000"/>
-              <w:bottom w:val="single" w:sz="1" w:space="0" w:color="000000"/>
-              <w:left w:val="single" w:sz="1" w:space="0" w:color="000000"/>
-              <w:right w:val="single" w:sz="1" w:space="0" w:color="000000"/>
-            </w:tcBorders>
-          </w:tcPr>
-          <w:p>
-            <w:pPr>
-              <w:spacing w:lineRule="auto"/>
-            </w:pPr>
-            <w:r>
-              <w:rPr/>
-              <w:t xml:space="preserve">Carrusel de imágenes (login e inicio).</w:t>
+              <w:t xml:space="preserve">EventSource (API web)</w:t>
+            </w:r>
+          </w:p>
+        </w:tc>
+        <w:tc>
+          <w:tcPr>
+            <w:tcBorders>
+              <w:top w:val="single" w:sz="1" w:space="0" w:color="000000"/>
+              <w:bottom w:val="single" w:sz="1" w:space="0" w:color="000000"/>
+              <w:left w:val="single" w:sz="1" w:space="0" w:color="000000"/>
+              <w:right w:val="single" w:sz="1" w:space="0" w:color="000000"/>
+            </w:tcBorders>
+          </w:tcPr>
+          <w:p>
+            <w:pPr>
+              <w:spacing w:lineRule="auto"/>
+            </w:pPr>
+            <w:r>
+              <w:rPr/>
+              <w:t xml:space="preserve">Suscripción del muro a los avisos en tiempo real.</w:t>
             </w:r>
           </w:p>
         </w:tc>
@@ -1334,44 +1565,26 @@
             </w:pPr>
             <w:r>
               <w:rPr/>
-              <w:t xml:space="preserve">oxlint</w:t>
-            </w:r>
-          </w:p>
-        </w:tc>
-        <w:tc>
-          <w:tcPr>
-            <w:tcBorders>
-              <w:top w:val="single" w:sz="1" w:space="0" w:color="000000"/>
-              <w:bottom w:val="single" w:sz="1" w:space="0" w:color="000000"/>
-              <w:left w:val="single" w:sz="1" w:space="0" w:color="000000"/>
-              <w:right w:val="single" w:sz="1" w:space="0" w:color="000000"/>
-            </w:tcBorders>
-          </w:tcPr>
-          <w:p>
-            <w:pPr>
-              <w:spacing w:lineRule="auto"/>
-            </w:pPr>
-            <w:r>
-              <w:rPr/>
-              <w:t xml:space="preserve">Linter (</w:t>
-            </w:r>
-          </w:p>
-          <w:p>
-            <w:pPr>
-              <w:spacing w:lineRule="auto"/>
-            </w:pPr>
-            <w:r>
-              <w:rPr/>
-              <w:t xml:space="preserve">npm run lint</w:t>
-            </w:r>
-          </w:p>
-          <w:p>
-            <w:pPr>
-              <w:spacing w:lineRule="auto"/>
-            </w:pPr>
-            <w:r>
-              <w:rPr/>
-              <w:t xml:space="preserve">).</w:t>
+              <w:t xml:space="preserve">swiper</w:t>
+            </w:r>
+          </w:p>
+        </w:tc>
+        <w:tc>
+          <w:tcPr>
+            <w:tcBorders>
+              <w:top w:val="single" w:sz="1" w:space="0" w:color="000000"/>
+              <w:bottom w:val="single" w:sz="1" w:space="0" w:color="000000"/>
+              <w:left w:val="single" w:sz="1" w:space="0" w:color="000000"/>
+              <w:right w:val="single" w:sz="1" w:space="0" w:color="000000"/>
+            </w:tcBorders>
+          </w:tcPr>
+          <w:p>
+            <w:pPr>
+              <w:spacing w:lineRule="auto"/>
+            </w:pPr>
+            <w:r>
+              <w:rPr/>
+              <w:t xml:space="preserve">Carrusel de imágenes (login e inicio).</w:t>
             </w:r>
           </w:p>
         </w:tc>
@@ -1395,6 +1608,110 @@
             </w:pPr>
             <w:r>
               <w:rPr/>
+              <w:t xml:space="preserve">oxlint</w:t>
+            </w:r>
+          </w:p>
+        </w:tc>
+        <w:tc>
+          <w:tcPr>
+            <w:tcBorders>
+              <w:top w:val="single" w:sz="1" w:space="0" w:color="000000"/>
+              <w:bottom w:val="single" w:sz="1" w:space="0" w:color="000000"/>
+              <w:left w:val="single" w:sz="1" w:space="0" w:color="000000"/>
+              <w:right w:val="single" w:sz="1" w:space="0" w:color="000000"/>
+            </w:tcBorders>
+          </w:tcPr>
+          <w:p>
+            <w:pPr>
+              <w:spacing w:lineRule="auto"/>
+            </w:pPr>
+            <w:r>
+              <w:rPr/>
+              <w:t xml:space="preserve">Linter (</w:t>
+            </w:r>
+          </w:p>
+          <w:p>
+            <w:pPr>
+              <w:spacing w:lineRule="auto"/>
+            </w:pPr>
+            <w:r>
+              <w:rPr/>
+              <w:t xml:space="preserve">npm run lint</w:t>
+            </w:r>
+          </w:p>
+          <w:p>
+            <w:pPr>
+              <w:spacing w:lineRule="auto"/>
+            </w:pPr>
+            <w:r>
+              <w:rPr/>
+              <w:t xml:space="preserve">).</w:t>
+            </w:r>
+          </w:p>
+        </w:tc>
+      </w:tr>
+      <w:tr>
+        <w:trPr>
+          <w:cantSplit/>
+        </w:trPr>
+        <w:tc>
+          <w:tcPr>
+            <w:tcBorders>
+              <w:top w:val="single" w:sz="1" w:space="0" w:color="000000"/>
+              <w:bottom w:val="single" w:sz="1" w:space="0" w:color="000000"/>
+              <w:left w:val="single" w:sz="1" w:space="0" w:color="000000"/>
+              <w:right w:val="single" w:sz="1" w:space="0" w:color="000000"/>
+            </w:tcBorders>
+          </w:tcPr>
+          <w:p>
+            <w:pPr>
+              <w:spacing w:lineRule="auto"/>
+            </w:pPr>
+            <w:r>
+              <w:rPr/>
+              <w:t xml:space="preserve">Playwright (@playwright/test)</w:t>
+            </w:r>
+          </w:p>
+        </w:tc>
+        <w:tc>
+          <w:tcPr>
+            <w:tcBorders>
+              <w:top w:val="single" w:sz="1" w:space="0" w:color="000000"/>
+              <w:bottom w:val="single" w:sz="1" w:space="0" w:color="000000"/>
+              <w:left w:val="single" w:sz="1" w:space="0" w:color="000000"/>
+              <w:right w:val="single" w:sz="1" w:space="0" w:color="000000"/>
+            </w:tcBorders>
+          </w:tcPr>
+          <w:p>
+            <w:pPr>
+              <w:spacing w:lineRule="auto"/>
+            </w:pPr>
+            <w:r>
+              <w:rPr/>
+              <w:t xml:space="preserve">Pruebas e2e (9 pruebas) en Chromium headless.</w:t>
+            </w:r>
+          </w:p>
+        </w:tc>
+      </w:tr>
+      <w:tr>
+        <w:trPr>
+          <w:cantSplit/>
+        </w:trPr>
+        <w:tc>
+          <w:tcPr>
+            <w:tcBorders>
+              <w:top w:val="single" w:sz="1" w:space="0" w:color="000000"/>
+              <w:bottom w:val="single" w:sz="1" w:space="0" w:color="000000"/>
+              <w:left w:val="single" w:sz="1" w:space="0" w:color="000000"/>
+              <w:right w:val="single" w:sz="1" w:space="0" w:color="000000"/>
+            </w:tcBorders>
+          </w:tcPr>
+          <w:p>
+            <w:pPr>
+              <w:spacing w:lineRule="auto"/>
+            </w:pPr>
+            <w:r>
+              <w:rPr/>
               <w:t xml:space="preserve">sharp</w:t>
             </w:r>
           </w:p>
@@ -1446,7 +1763,7 @@
         <w:rPr>
           <w:rFonts w:ascii="Courier" w:hAnsi="Courier"/>
         </w:rPr>
-        <w:t xml:space="preserve"> proyecto/ ├── index.js                 # API principal (Express, ~1300 líneas) ├── db.js                    # Pool de conexiones MySQL + health check ├── filtroProfano.js         # Filtro de groserías (leetspeak, repetidos) ├── .env.example             # Plantilla de variables de entorno ├── requintu_dump.sql        # Respaldo del esquema/datos ├── vercel.json              # Config de despliegue del frontend (SPA) ├── netlify.toml             # Alternativa de despliegue (Netlify) ├── package.json             # Dependencias del backend └── frontend/     ├── capacitor.config.json   # Config de Capacitor (appId, webDir)     ├── index.html              # HTML base (sin service worker)     ├── vite.config.js     └── src/         ├── main.jsx            # Punto de entrada (React Router + AuthProvider)         ├── App.jsx             # Rutas de la SPA         ├── config.js           # API_URL según VITE_BACKEND_ORIGIN         ├── context/AuthContext.jsx   # Sesión: login, logout, refresco automático         ├── components/         # Navbar, ProtectedRoute, AdminRoute, InstallBanner, FondoPagina         ├── pages/              # Home, Login, Register, MapaColombia, Locales,         │                       # LocalDetalle, CrearLocal, Publicaciones, Perfil,         │                       # Admin, OlvidePassword, ResetPassword         └── assets/             # co-departamentos.svg, imágenes </w:t>
+        <w:t xml:space="preserve"> proyecto/ ├── index.js                 # API principal (Express, rutas REST + SSE) ├── db.js                    # Pool de conexiones MySQL + health check ├── emailQueue.js            # Cola de correos con reintentos y backoff (Brevo) ├── filtroProfano.js         # Filtro de groserías (leetspeak, repetidos) ├── .env.example             # Plantilla de variables de entorno ├── requintu_dump.sql        # Respaldo del esquema/datos (incluye cola_emails) ├── netlify.toml             # Alternativa de despliegue (Netlify) ├── package.json             # Dependencias del backend ├── test/ │   └── api.test.mjs         # 21 pruebas de integración (node:test) ├── Documentacion_Tecnica_Requintu.pdf|docx ├── Manual_de_Uso_Requintu.pdf / Informe_de_Pruebas_Requintu.pdf ├── Requintu-app-release.aab|apk / Requintu-app-debug.apk  (builds firmados) └── frontend/     ├── capacitor.config.json   # Config de Capacitor (appId, webDir)     ├── index.html              # HTML base     ├── vercel.json             # Config de Vercel (framework, rewrites SPA)     ├── vite.config.js     ├── playwright.config.js    # E2E: backend local + preview de producción     ├── e2e/                    # specs: inicio, privacidad, auth, muro     ├── public/     │   ├── sw.js               # service worker auto-destructivo (PWA desactivada)     │   └── politica-de-privacidad.html     ├── android/                # proyecto Capacitor (firma release en app/build.gradle)     └── src/         ├── main.jsx            # Punto de entrada (React Router + AuthProvider)         ├── App.jsx             # Rutas de la SPA         ├── config.js           # API_URL según VITE_BACKEND_ORIGIN         ├── context/AuthContext.jsx   # Sesión: login, logout, refresco automático         ├── components/         # Navbar, ProtectedRoute, AdminRoute, InstallBanner, FondoPagina         ├── pages/              # Home, Login, Register, MapaColombia, Locales,         │                       # LocalDetalle, CrearLocal, Publicaciones, Perfil,         │                       # Admin, OlvidePassword, ResetPassword, PoliticaPrivacidad         └── assets/             # co-departamentos.svg, imágenes </w:t>
       </w:r>
     </w:p>
     <w:p>
@@ -1517,7 +1834,15 @@
       </w:r>
       <w:r>
         <w:rPr/>
-        <w:t xml:space="preserve"> para permitir el login desde la app nativa.</w:t>
+        <w:t xml:space="preserve"> para permitir el login desde la app nativa. Al arrancar verifica la conexión a la BD y levanta la cola de correos (</w:t>
+      </w:r>
+      <w:r>
+        <w:rPr/>
+        <w:t xml:space="preserve">iniciarColaCorreos()</w:t>
+      </w:r>
+      <w:r>
+        <w:rPr/>
+        <w:t xml:space="preserve">).</w:t>
       </w:r>
     </w:p>
     <w:p>
@@ -1890,7 +2215,7 @@
       </w:pPr>
       <w:r>
         <w:rPr/>
-        <w:t xml:space="preserve">5.5 Recuperación de contraseña (Brevo)</w:t>
+        <w:t xml:space="preserve">5.5 Recuperación de contraseña (Brevo vía cola)</w:t>
       </w:r>
     </w:p>
     <w:p>
@@ -1921,7 +2246,25 @@
       </w:r>
       <w:r>
         <w:rPr/>
-        <w:t xml:space="preserve"> y envía un correo con el enlace mediante la </w:t>
+        <w:t xml:space="preserve">. El correo con el enlace se </w:t>
+      </w:r>
+      <w:r>
+        <w:rPr>
+          <w:b/>
+        </w:rPr>
+        <w:t xml:space="preserve">encola</w:t>
+      </w:r>
+      <w:r>
+        <w:rPr/>
+        <w:t xml:space="preserve"> en la tabla </w:t>
+      </w:r>
+      <w:r>
+        <w:rPr/>
+        <w:t xml:space="preserve">cola_emails</w:t>
+      </w:r>
+      <w:r>
+        <w:rPr/>
+        <w:t xml:space="preserve"> y un procesador lo envía con la </w:t>
       </w:r>
       <w:r>
         <w:rPr>
@@ -1931,7 +2274,7 @@
       </w:r>
       <w:r>
         <w:rPr/>
-        <w:t xml:space="preserve"> (fetch HTTPS a </w:t>
+        <w:t xml:space="preserve"> (</w:t>
       </w:r>
       <w:r>
         <w:rPr/>
@@ -1939,7 +2282,7 @@
       </w:r>
       <w:r>
         <w:rPr/>
-        <w:t xml:space="preserve">). </w:t>
+        <w:t xml:space="preserve">) con reintentos y backoff; la respuesta de la API no se bloquea esperando el envío. </w:t>
       </w:r>
       <w:r>
         <w:rPr/>
@@ -1957,7 +2300,172 @@
       </w:pPr>
       <w:r>
         <w:rPr/>
-        <w:t xml:space="preserve">5.6 Seguridad</w:t>
+        <w:t xml:space="preserve">5.6 Avisos en tiempo real del muro (SSE)</w:t>
+      </w:r>
+    </w:p>
+    <w:p>
+      <w:pPr>
+        <w:numPr>
+          <w:ilvl w:val="0"/>
+          <w:numId w:val="4"/>
+        </w:numPr>
+        <w:spacing w:lineRule="auto"/>
+      </w:pPr>
+      <w:r>
+        <w:rPr>
+          <w:b/>
+        </w:rPr>
+        <w:t xml:space="preserve">Endpoint:</w:t>
+      </w:r>
+      <w:r>
+        <w:rPr/>
+        <w:t xml:space="preserve">GET /api/eventos</w:t>
+      </w:r>
+      <w:r>
+        <w:rPr/>
+        <w:t xml:space="preserve"> (público, </w:t>
+      </w:r>
+      <w:r>
+        <w:rPr/>
+        <w:t xml:space="preserve">Content-Type: text/event-stream</w:t>
+      </w:r>
+      <w:r>
+        <w:rPr/>
+        <w:t xml:space="preserve">). El frontend se suscribe con </w:t>
+      </w:r>
+      <w:r>
+        <w:rPr>
+          <w:b/>
+        </w:rPr>
+        <w:t xml:space="preserve">EventSource</w:t>
+      </w:r>
+      <w:r>
+        <w:rPr/>
+        <w:t xml:space="preserve"> y el servidor mantiene la conexión abierta.</w:t>
+      </w:r>
+    </w:p>
+    <w:p>
+      <w:pPr>
+        <w:numPr>
+          <w:ilvl w:val="0"/>
+          <w:numId w:val="4"/>
+        </w:numPr>
+        <w:spacing w:lineRule="auto"/>
+      </w:pPr>
+      <w:r>
+        <w:rPr>
+          <w:b/>
+        </w:rPr>
+        <w:t xml:space="preserve">Eventos emitidos:</w:t>
+      </w:r>
+      <w:r>
+        <w:rPr/>
+        <w:t xml:space="preserve">nueva</w:t>
+      </w:r>
+      <w:r>
+        <w:rPr/>
+        <w:t xml:space="preserve"> (id, usuario_id y autor al crear una publicación), </w:t>
+      </w:r>
+      <w:r>
+        <w:rPr/>
+        <w:t xml:space="preserve">editada</w:t>
+      </w:r>
+      <w:r>
+        <w:rPr/>
+        <w:t xml:space="preserve"> y </w:t>
+      </w:r>
+      <w:r>
+        <w:rPr/>
+        <w:t xml:space="preserve">borrada</w:t>
+      </w:r>
+      <w:r>
+        <w:rPr/>
+        <w:t xml:space="preserve"> (id). Incluye la moderación del admin.</w:t>
+      </w:r>
+    </w:p>
+    <w:p>
+      <w:pPr>
+        <w:numPr>
+          <w:ilvl w:val="0"/>
+          <w:numId w:val="4"/>
+        </w:numPr>
+        <w:spacing w:lineRule="auto"/>
+      </w:pPr>
+      <w:r>
+        <w:rPr>
+          <w:b/>
+        </w:rPr>
+        <w:t xml:space="preserve">Heartbeat:</w:t>
+      </w:r>
+      <w:r>
+        <w:rPr/>
+        <w:t xml:space="preserve"> cada 25 s se envía un comentario </w:t>
+      </w:r>
+      <w:r>
+        <w:rPr/>
+        <w:t xml:space="preserve">: latido</w:t>
+      </w:r>
+      <w:r>
+        <w:rPr/>
+        <w:t xml:space="preserve"> para mantener viva la conexión en proxies (p. ej. Render) y detectar clientes caídos.</w:t>
+      </w:r>
+    </w:p>
+    <w:p>
+      <w:pPr>
+        <w:numPr>
+          <w:ilvl w:val="0"/>
+          <w:numId w:val="4"/>
+        </w:numPr>
+        <w:spacing w:lineRule="auto"/>
+      </w:pPr>
+      <w:r>
+        <w:rPr>
+          <w:b/>
+        </w:rPr>
+        <w:t xml:space="preserve">Publicación (broadcast):</w:t>
+      </w:r>
+      <w:r>
+        <w:rPr/>
+        <w:t xml:space="preserve"> los clientes suscritos se guardan en un </w:t>
+      </w:r>
+      <w:r>
+        <w:rPr/>
+        <w:t xml:space="preserve">Set</w:t>
+      </w:r>
+      <w:r>
+        <w:rPr/>
+        <w:t xml:space="preserve"> en memoria; cada evento se serializa y se escribe a todas las conexiones.</w:t>
+      </w:r>
+    </w:p>
+    <w:p>
+      <w:pPr>
+        <w:numPr>
+          <w:ilvl w:val="0"/>
+          <w:numId w:val="4"/>
+        </w:numPr>
+        <w:spacing w:lineRule="auto"/>
+      </w:pPr>
+      <w:r>
+        <w:rPr/>
+        <w:t xml:space="preserve">No requiere dependencias nuevas (usa el </w:t>
+      </w:r>
+      <w:r>
+        <w:rPr/>
+        <w:t xml:space="preserve">res</w:t>
+      </w:r>
+      <w:r>
+        <w:rPr/>
+        <w:t xml:space="preserve"> de Express) y respeta CORS de la API.</w:t>
+      </w:r>
+    </w:p>
+    <w:p>
+      <w:pPr>
+        <w:pStyle w:val="Heading2"/>
+        <w:spacing w:lineRule="auto"/>
+      </w:pPr>
+      <w:r>
+        <w:rPr/>
+        <w:t xml:space="preserve">5.7 Seguridad</w:t>
       </w:r>
     </w:p>
     <w:tbl>
@@ -1978,8 +2486,8 @@
         <w:jc w:val="center"/>
       </w:tblPr>
       <w:tblGrid>
-        <w:gridCol w:w="5320"/>
-        <w:gridCol w:w="5320"/>
+        <w:gridCol w:w="5400"/>
+        <w:gridCol w:w="5400"/>
       </w:tblGrid>
       <w:tr>
         <w:trPr>
@@ -2353,7 +2861,27 @@
             </w:pPr>
             <w:r>
               <w:rPr/>
-              <w:t xml:space="preserve">, extensión y MIME comprobados, máx. 5 MB.</w:t>
+              <w:t xml:space="preserve">; extensión, MIME y </w:t>
+            </w:r>
+          </w:p>
+          <w:p>
+            <w:pPr>
+              <w:spacing w:lineRule="auto"/>
+            </w:pPr>
+            <w:r>
+              <w:rPr>
+                <w:b/>
+              </w:rPr>
+              <w:t xml:space="preserve">magic bytes</w:t>
+            </w:r>
+          </w:p>
+          <w:p>
+            <w:pPr>
+              <w:spacing w:lineRule="auto"/>
+            </w:pPr>
+            <w:r>
+              <w:rPr/>
+              <w:t xml:space="preserve"> comprobados (400 si no es una imagen real), máx. 5 MB.</w:t>
             </w:r>
           </w:p>
         </w:tc>
@@ -2462,6 +2990,49 @@
           </w:p>
         </w:tc>
       </w:tr>
+      <w:tr>
+        <w:trPr>
+          <w:cantSplit/>
+        </w:trPr>
+        <w:tc>
+          <w:tcPr>
+            <w:tcBorders>
+              <w:top w:val="single" w:sz="1" w:space="0" w:color="000000"/>
+              <w:bottom w:val="single" w:sz="1" w:space="0" w:color="000000"/>
+              <w:left w:val="single" w:sz="1" w:space="0" w:color="000000"/>
+              <w:right w:val="single" w:sz="1" w:space="0" w:color="000000"/>
+            </w:tcBorders>
+          </w:tcPr>
+          <w:p>
+            <w:pPr>
+              <w:spacing w:lineRule="auto"/>
+            </w:pPr>
+            <w:r>
+              <w:rPr/>
+              <w:t xml:space="preserve">Correo</w:t>
+            </w:r>
+          </w:p>
+        </w:tc>
+        <w:tc>
+          <w:tcPr>
+            <w:tcBorders>
+              <w:top w:val="single" w:sz="1" w:space="0" w:color="000000"/>
+              <w:bottom w:val="single" w:sz="1" w:space="0" w:color="000000"/>
+              <w:left w:val="single" w:sz="1" w:space="0" w:color="000000"/>
+              <w:right w:val="single" w:sz="1" w:space="0" w:color="000000"/>
+            </w:tcBorders>
+          </w:tcPr>
+          <w:p>
+            <w:pPr>
+              <w:spacing w:lineRule="auto"/>
+            </w:pPr>
+            <w:r>
+              <w:rPr/>
+              <w:t xml:space="preserve">Cola persistida con reintentos, backoff exponencial y registro del error en BD.</w:t>
+            </w:r>
+          </w:p>
+        </w:tc>
+      </w:tr>
     </w:tbl>
     <w:p>
       <w:pPr>
@@ -2478,7 +3049,7 @@
       </w:pPr>
       <w:r>
         <w:rPr/>
-        <w:t xml:space="preserve">5.7 Subida de imágenes</w:t>
+        <w:t xml:space="preserve">5.8 Subida de imágenes</w:t>
       </w:r>
     </w:p>
     <w:p>
@@ -2491,7 +3062,17 @@
       </w:r>
       <w:r>
         <w:rPr/>
-        <w:t xml:space="preserve"> (protegido) recibe la imagen con Multer, la sube a </w:t>
+        <w:t xml:space="preserve"> (protegido) recibe la imagen con Multer, comprueba sus </w:t>
+      </w:r>
+      <w:r>
+        <w:rPr>
+          <w:b/>
+        </w:rPr>
+        <w:t xml:space="preserve">magic bytes</w:t>
+      </w:r>
+      <w:r>
+        <w:rPr/>
+        <w:t xml:space="preserve"> (JPEG, PNG o WebP) rechazando archivos que no sean imágenes reales (respuesta 400), la sube a </w:t>
       </w:r>
       <w:r>
         <w:rPr>
@@ -2510,6 +3091,168 @@
       <w:r>
         <w:rPr/>
         <w:t xml:space="preserve"> (carpeta según entidad) y devuelve la URL pública. El frontend usa esta URL para persistir locales, planes y publicaciones.</w:t>
+      </w:r>
+    </w:p>
+    <w:p>
+      <w:pPr>
+        <w:pStyle w:val="Heading2"/>
+        <w:spacing w:lineRule="auto"/>
+      </w:pPr>
+      <w:r>
+        <w:rPr/>
+        <w:t xml:space="preserve">5.9 Cola de correos con reintentos (</w:t>
+      </w:r>
+      <w:r>
+        <w:rPr/>
+        <w:t xml:space="preserve">emailQueue.js</w:t>
+      </w:r>
+      <w:r>
+        <w:rPr/>
+        <w:t xml:space="preserve">)</w:t>
+      </w:r>
+    </w:p>
+    <w:p>
+      <w:pPr>
+        <w:numPr>
+          <w:ilvl w:val="0"/>
+          <w:numId w:val="5"/>
+        </w:numPr>
+        <w:spacing w:lineRule="auto"/>
+      </w:pPr>
+      <w:r>
+        <w:rPr>
+          <w:b/>
+        </w:rPr>
+        <w:t xml:space="preserve">Persistencia:</w:t>
+      </w:r>
+      <w:r>
+        <w:rPr/>
+        <w:t xml:space="preserve"> tabla </w:t>
+      </w:r>
+      <w:r>
+        <w:rPr/>
+        <w:t xml:space="preserve">cola_emails</w:t>
+      </w:r>
+      <w:r>
+        <w:rPr/>
+        <w:t xml:space="preserve"> (destinatario, asunto, HTML, estado </w:t>
+      </w:r>
+      <w:r>
+        <w:rPr>
+          <w:i/>
+        </w:rPr>
+        <w:t xml:space="preserve">pendiente/enviado/fallido</w:t>
+      </w:r>
+      <w:r>
+        <w:rPr/>
+        <w:t xml:space="preserve">, intentos, próximo intento, error). La tabla se crea automáticamente (</w:t>
+      </w:r>
+      <w:r>
+        <w:rPr/>
+        <w:t xml:space="preserve">CREATE TABLE IF NOT EXISTS</w:t>
+      </w:r>
+      <w:r>
+        <w:rPr/>
+        <w:t xml:space="preserve">).</w:t>
+      </w:r>
+    </w:p>
+    <w:p>
+      <w:pPr>
+        <w:numPr>
+          <w:ilvl w:val="0"/>
+          <w:numId w:val="5"/>
+        </w:numPr>
+        <w:spacing w:lineRule="auto"/>
+      </w:pPr>
+      <w:r>
+        <w:rPr>
+          <w:b/>
+        </w:rPr>
+        <w:t xml:space="preserve">Encaje:</w:t>
+      </w:r>
+      <w:r>
+        <w:rPr/>
+        <w:t xml:space="preserve">encolarCorreo()</w:t>
+      </w:r>
+      <w:r>
+        <w:rPr/>
+        <w:t xml:space="preserve"> inserta la fila y dispara el procesamiento; nunca lanza. Si la BD no responde, el correo se conserva en memoria.</w:t>
+      </w:r>
+    </w:p>
+    <w:p>
+      <w:pPr>
+        <w:numPr>
+          <w:ilvl w:val="0"/>
+          <w:numId w:val="5"/>
+        </w:numPr>
+        <w:spacing w:lineRule="auto"/>
+      </w:pPr>
+      <w:r>
+        <w:rPr>
+          <w:b/>
+        </w:rPr>
+        <w:t xml:space="preserve">Procesamiento:</w:t>
+      </w:r>
+      <w:r>
+        <w:rPr/>
+        <w:t xml:space="preserve"> un worker envía por Brevo los pendientes cuyo </w:t>
+      </w:r>
+      <w:r>
+        <w:rPr>
+          <w:i/>
+        </w:rPr>
+        <w:t xml:space="preserve">próximo_intento</w:t>
+      </w:r>
+      <w:r>
+        <w:rPr/>
+        <w:t xml:space="preserve"> ya venció. Al fallar, incrementa intentos y programa el siguiente con </w:t>
+      </w:r>
+      <w:r>
+        <w:rPr>
+          <w:b/>
+        </w:rPr>
+        <w:t xml:space="preserve">backoff exponencial</w:t>
+      </w:r>
+      <w:r>
+        <w:rPr/>
+        <w:t xml:space="preserve"> (1, 2, 4 y 8 min). Tras 5 intentos marca </w:t>
+      </w:r>
+      <w:r>
+        <w:rPr>
+          <w:i/>
+        </w:rPr>
+        <w:t xml:space="preserve">fallido</w:t>
+      </w:r>
+      <w:r>
+        <w:rPr/>
+        <w:t xml:space="preserve"> y registra el error.</w:t>
+      </w:r>
+    </w:p>
+    <w:p>
+      <w:pPr>
+        <w:numPr>
+          <w:ilvl w:val="0"/>
+          <w:numId w:val="5"/>
+        </w:numPr>
+        <w:spacing w:lineRule="auto"/>
+      </w:pPr>
+      <w:r>
+        <w:rPr>
+          <w:b/>
+        </w:rPr>
+        <w:t xml:space="preserve">Resiliencia:</w:t>
+      </w:r>
+      <w:r>
+        <w:rPr/>
+        <w:t xml:space="preserve"> al iniciar el servidor (</w:t>
+      </w:r>
+      <w:r>
+        <w:rPr/>
+        <w:t xml:space="preserve">iniciarColaCorreos()</w:t>
+      </w:r>
+      <w:r>
+        <w:rPr/>
+        <w:t xml:space="preserve">) se reanudan los correos que quedaron pendientes (sobreviven reinicios), con escaneo automático cada 15 s.</w:t>
       </w:r>
     </w:p>
     <w:p>
@@ -2550,10 +3293,10 @@
         <w:jc w:val="center"/>
       </w:tblPr>
       <w:tblGrid>
-        <w:gridCol w:w="2660"/>
-        <w:gridCol w:w="2660"/>
-        <w:gridCol w:w="2660"/>
-        <w:gridCol w:w="2660"/>
+        <w:gridCol w:w="2700"/>
+        <w:gridCol w:w="2700"/>
+        <w:gridCol w:w="2700"/>
+        <w:gridCol w:w="2700"/>
       </w:tblGrid>
       <w:tr>
         <w:trPr>
@@ -3036,7 +3779,7 @@
             </w:pPr>
             <w:r>
               <w:rPr/>
-              <w:t xml:space="preserve">Envía enlace de recuperación (Brevo).</w:t>
+              <w:t xml:space="preserve">Encola el enlace de recuperación (Brevo).</w:t>
             </w:r>
           </w:p>
         </w:tc>
@@ -3240,10 +3983,10 @@
         <w:jc w:val="center"/>
       </w:tblPr>
       <w:tblGrid>
-        <w:gridCol w:w="2660"/>
-        <w:gridCol w:w="2660"/>
-        <w:gridCol w:w="2660"/>
-        <w:gridCol w:w="2660"/>
+        <w:gridCol w:w="2700"/>
+        <w:gridCol w:w="2700"/>
+        <w:gridCol w:w="2700"/>
+        <w:gridCol w:w="2700"/>
       </w:tblGrid>
       <w:tr>
         <w:trPr>
@@ -3646,6 +4389,107 @@
             <w:r>
               <w:rPr/>
               <w:t xml:space="preserve">Municipios de un departamento.</w:t>
+            </w:r>
+          </w:p>
+        </w:tc>
+      </w:tr>
+      <w:tr>
+        <w:trPr>
+          <w:cantSplit/>
+        </w:trPr>
+        <w:tc>
+          <w:tcPr>
+            <w:tcBorders>
+              <w:top w:val="single" w:sz="1" w:space="0" w:color="000000"/>
+              <w:bottom w:val="single" w:sz="1" w:space="0" w:color="000000"/>
+              <w:left w:val="single" w:sz="1" w:space="0" w:color="000000"/>
+              <w:right w:val="single" w:sz="1" w:space="0" w:color="000000"/>
+            </w:tcBorders>
+          </w:tcPr>
+          <w:p>
+            <w:pPr>
+              <w:spacing w:lineRule="auto"/>
+            </w:pPr>
+            <w:r>
+              <w:rPr/>
+              <w:t xml:space="preserve">GET</w:t>
+            </w:r>
+          </w:p>
+        </w:tc>
+        <w:tc>
+          <w:tcPr>
+            <w:tcBorders>
+              <w:top w:val="single" w:sz="1" w:space="0" w:color="000000"/>
+              <w:bottom w:val="single" w:sz="1" w:space="0" w:color="000000"/>
+              <w:left w:val="single" w:sz="1" w:space="0" w:color="000000"/>
+              <w:right w:val="single" w:sz="1" w:space="0" w:color="000000"/>
+            </w:tcBorders>
+          </w:tcPr>
+          <w:p>
+            <w:pPr>
+              <w:spacing w:lineRule="auto"/>
+            </w:pPr>
+            <w:r>
+              <w:rPr/>
+              <w:t xml:space="preserve">/api/eventos</w:t>
+            </w:r>
+          </w:p>
+        </w:tc>
+        <w:tc>
+          <w:tcPr>
+            <w:tcBorders>
+              <w:top w:val="single" w:sz="1" w:space="0" w:color="000000"/>
+              <w:bottom w:val="single" w:sz="1" w:space="0" w:color="000000"/>
+              <w:left w:val="single" w:sz="1" w:space="0" w:color="000000"/>
+              <w:right w:val="single" w:sz="1" w:space="0" w:color="000000"/>
+            </w:tcBorders>
+          </w:tcPr>
+          <w:p>
+            <w:pPr>
+              <w:spacing w:lineRule="auto"/>
+            </w:pPr>
+            <w:r>
+              <w:rPr/>
+              <w:t xml:space="preserve">Público</w:t>
+            </w:r>
+          </w:p>
+        </w:tc>
+        <w:tc>
+          <w:tcPr>
+            <w:tcBorders>
+              <w:top w:val="single" w:sz="1" w:space="0" w:color="000000"/>
+              <w:bottom w:val="single" w:sz="1" w:space="0" w:color="000000"/>
+              <w:left w:val="single" w:sz="1" w:space="0" w:color="000000"/>
+              <w:right w:val="single" w:sz="1" w:space="0" w:color="000000"/>
+            </w:tcBorders>
+          </w:tcPr>
+          <w:p>
+            <w:pPr>
+              <w:spacing w:lineRule="auto"/>
+            </w:pPr>
+            <w:r>
+              <w:rPr/>
+              <w:t xml:space="preserve">Canal SSE de avisos del muro (</w:t>
+            </w:r>
+          </w:p>
+          <w:p>
+            <w:pPr>
+              <w:spacing w:lineRule="auto"/>
+            </w:pPr>
+            <w:r>
+              <w:rPr>
+                <w:i/>
+              </w:rPr>
+              <w:t xml:space="preserve">nueva/editada/borrada</w:t>
+            </w:r>
+          </w:p>
+          <w:p>
+            <w:pPr>
+              <w:spacing w:lineRule="auto"/>
+            </w:pPr>
+            <w:r>
+              <w:rPr/>
+              <w:t xml:space="preserve">).</w:t>
             </w:r>
           </w:p>
         </w:tc>
@@ -3687,10 +4531,10 @@
         <w:jc w:val="center"/>
       </w:tblPr>
       <w:tblGrid>
-        <w:gridCol w:w="2660"/>
-        <w:gridCol w:w="2660"/>
-        <w:gridCol w:w="2660"/>
-        <w:gridCol w:w="2660"/>
+        <w:gridCol w:w="2700"/>
+        <w:gridCol w:w="2700"/>
+        <w:gridCol w:w="2700"/>
+        <w:gridCol w:w="2700"/>
       </w:tblGrid>
       <w:tr>
         <w:trPr>
@@ -4620,10 +5464,10 @@
         <w:jc w:val="center"/>
       </w:tblPr>
       <w:tblGrid>
-        <w:gridCol w:w="2660"/>
-        <w:gridCol w:w="2660"/>
-        <w:gridCol w:w="2660"/>
-        <w:gridCol w:w="2660"/>
+        <w:gridCol w:w="2700"/>
+        <w:gridCol w:w="2700"/>
+        <w:gridCol w:w="2700"/>
+        <w:gridCol w:w="2700"/>
       </w:tblGrid>
       <w:tr>
         <w:trPr>
@@ -4782,7 +5626,7 @@
             </w:pPr>
             <w:r>
               <w:rPr/>
-              <w:t xml:space="preserve">Sube imagen a Cloudinary.</w:t>
+              <w:t xml:space="preserve">Sube imagen a Cloudinary (valida formato real).</w:t>
             </w:r>
           </w:p>
         </w:tc>
@@ -4944,7 +5788,27 @@
             </w:pPr>
             <w:r>
               <w:rPr/>
-              <w:t xml:space="preserve">Publica contenido.</w:t>
+              <w:t xml:space="preserve">Publica contenido (emite evento SSE </w:t>
+            </w:r>
+          </w:p>
+          <w:p>
+            <w:pPr>
+              <w:spacing w:lineRule="auto"/>
+            </w:pPr>
+            <w:r>
+              <w:rPr>
+                <w:i/>
+              </w:rPr>
+              <w:t xml:space="preserve">nueva</w:t>
+            </w:r>
+          </w:p>
+          <w:p>
+            <w:pPr>
+              <w:spacing w:lineRule="auto"/>
+            </w:pPr>
+            <w:r>
+              <w:rPr/>
+              <w:t xml:space="preserve">).</w:t>
             </w:r>
           </w:p>
         </w:tc>
@@ -5025,7 +5889,47 @@
             </w:pPr>
             <w:r>
               <w:rPr/>
-              <w:t xml:space="preserve">Edita / elimina (autor/admin).</w:t>
+              <w:t xml:space="preserve">Edita / elimina (autor/admin; emite </w:t>
+            </w:r>
+          </w:p>
+          <w:p>
+            <w:pPr>
+              <w:spacing w:lineRule="auto"/>
+            </w:pPr>
+            <w:r>
+              <w:rPr>
+                <w:i/>
+              </w:rPr>
+              <w:t xml:space="preserve">editada</w:t>
+            </w:r>
+          </w:p>
+          <w:p>
+            <w:pPr>
+              <w:spacing w:lineRule="auto"/>
+            </w:pPr>
+            <w:r>
+              <w:rPr/>
+              <w:t xml:space="preserve">/</w:t>
+            </w:r>
+          </w:p>
+          <w:p>
+            <w:pPr>
+              <w:spacing w:lineRule="auto"/>
+            </w:pPr>
+            <w:r>
+              <w:rPr>
+                <w:i/>
+              </w:rPr>
+              <w:t xml:space="preserve">borrada</w:t>
+            </w:r>
+          </w:p>
+          <w:p>
+            <w:pPr>
+              <w:spacing w:lineRule="auto"/>
+            </w:pPr>
+            <w:r>
+              <w:rPr/>
+              <w:t xml:space="preserve">).</w:t>
             </w:r>
           </w:p>
         </w:tc>
@@ -5077,9 +5981,9 @@
         <w:jc w:val="center"/>
       </w:tblPr>
       <w:tblGrid>
-        <w:gridCol w:w="3546.6666666666665"/>
-        <w:gridCol w:w="3546.6666666666665"/>
-        <w:gridCol w:w="3546.6666666666665"/>
+        <w:gridCol w:w="3600"/>
+        <w:gridCol w:w="3600"/>
+        <w:gridCol w:w="3600"/>
       </w:tblGrid>
       <w:tr>
         <w:trPr>
@@ -5572,7 +6476,27 @@
             </w:pPr>
             <w:r>
               <w:rPr/>
-              <w:t xml:space="preserve">Modera (elimina) una publicación.</w:t>
+              <w:t xml:space="preserve">Modera (elimina) una publicación (emite SSE </w:t>
+            </w:r>
+          </w:p>
+          <w:p>
+            <w:pPr>
+              <w:spacing w:lineRule="auto"/>
+            </w:pPr>
+            <w:r>
+              <w:rPr>
+                <w:i/>
+              </w:rPr>
+              <w:t xml:space="preserve">borrada</w:t>
+            </w:r>
+          </w:p>
+          <w:p>
+            <w:pPr>
+              <w:spacing w:lineRule="auto"/>
+            </w:pPr>
+            <w:r>
+              <w:rPr/>
+              <w:t xml:space="preserve">).</w:t>
             </w:r>
           </w:p>
         </w:tc>
@@ -5631,9 +6555,9 @@
         <w:jc w:val="center"/>
       </w:tblPr>
       <w:tblGrid>
-        <w:gridCol w:w="3546.6666666666665"/>
-        <w:gridCol w:w="3546.6666666666665"/>
-        <w:gridCol w:w="3546.6666666666665"/>
+        <w:gridCol w:w="3600"/>
+        <w:gridCol w:w="3600"/>
+        <w:gridCol w:w="3600"/>
       </w:tblGrid>
       <w:tr>
         <w:trPr>
@@ -6274,6 +7198,68 @@
             </w:pPr>
             <w:r>
               <w:rPr/>
+              <w:t xml:space="preserve">cola_emails</w:t>
+            </w:r>
+          </w:p>
+        </w:tc>
+        <w:tc>
+          <w:tcPr>
+            <w:tcBorders>
+              <w:top w:val="single" w:sz="1" w:space="0" w:color="000000"/>
+              <w:bottom w:val="single" w:sz="1" w:space="0" w:color="000000"/>
+              <w:left w:val="single" w:sz="1" w:space="0" w:color="000000"/>
+              <w:right w:val="single" w:sz="1" w:space="0" w:color="000000"/>
+            </w:tcBorders>
+          </w:tcPr>
+          <w:p>
+            <w:pPr>
+              <w:spacing w:lineRule="auto"/>
+            </w:pPr>
+            <w:r>
+              <w:rPr/>
+              <w:t xml:space="preserve">Cola de correos: destinatario, asunto, HTML, estado (pendiente/enviado/fallido), intentos, próximo intento y error.</w:t>
+            </w:r>
+          </w:p>
+        </w:tc>
+        <w:tc>
+          <w:tcPr>
+            <w:tcBorders>
+              <w:top w:val="single" w:sz="1" w:space="0" w:color="000000"/>
+              <w:bottom w:val="single" w:sz="1" w:space="0" w:color="000000"/>
+              <w:left w:val="single" w:sz="1" w:space="0" w:color="000000"/>
+              <w:right w:val="single" w:sz="1" w:space="0" w:color="000000"/>
+            </w:tcBorders>
+          </w:tcPr>
+          <w:p>
+            <w:pPr>
+              <w:spacing w:lineRule="auto"/>
+            </w:pPr>
+            <w:r>
+              <w:rPr/>
+              <w:t xml:space="preserve">PK id; INDEX (estado, proximo_intento)</w:t>
+            </w:r>
+          </w:p>
+        </w:tc>
+      </w:tr>
+      <w:tr>
+        <w:trPr>
+          <w:cantSplit/>
+        </w:trPr>
+        <w:tc>
+          <w:tcPr>
+            <w:tcBorders>
+              <w:top w:val="single" w:sz="1" w:space="0" w:color="000000"/>
+              <w:bottom w:val="single" w:sz="1" w:space="0" w:color="000000"/>
+              <w:left w:val="single" w:sz="1" w:space="0" w:color="000000"/>
+              <w:right w:val="single" w:sz="1" w:space="0" w:color="000000"/>
+            </w:tcBorders>
+          </w:tcPr>
+          <w:p>
+            <w:pPr>
+              <w:spacing w:lineRule="auto"/>
+            </w:pPr>
+            <w:r>
+              <w:rPr/>
               <w:t xml:space="preserve">posts</w:t>
             </w:r>
           </w:p>
@@ -6332,7 +7318,7 @@
       </w:pPr>
       <w:r>
         <w:rPr/>
-        <w:t xml:space="preserve">Nota: en los INSERT del respaldo los acentos aparecen con caracteres de escape (‹QuindÃ–O›); las tablas usan juego de caracteres utf8mb4.</w:t>
+        <w:t xml:space="preserve">Nota: en los INSERT del respaldo los acentos aparecen con caracteres de escape; las tablas usan juego de caracteres utf8mb4.</w:t>
       </w:r>
     </w:p>
     <w:p>
@@ -6442,6 +7428,14 @@
       <w:r>
         <w:rPr/>
         <w:t xml:space="preserve">/reset-password</w:t>
+      </w:r>
+      <w:r>
+        <w:rPr/>
+        <w:t xml:space="preserve">, </w:t>
+      </w:r>
+      <w:r>
+        <w:rPr/>
+        <w:t xml:space="preserve">/politica-de-privacidad</w:t>
       </w:r>
       <w:r>
         <w:rPr/>
@@ -6552,7 +7546,7 @@
       <w:pPr>
         <w:numPr>
           <w:ilvl w:val="0"/>
-          <w:numId w:val="4"/>
+          <w:numId w:val="6"/>
         </w:numPr>
         <w:spacing w:lineRule="auto"/>
       </w:pPr>
@@ -6585,7 +7579,7 @@
       <w:pPr>
         <w:numPr>
           <w:ilvl w:val="0"/>
-          <w:numId w:val="4"/>
+          <w:numId w:val="6"/>
         </w:numPr>
         <w:spacing w:lineRule="auto"/>
       </w:pPr>
@@ -6606,7 +7600,7 @@
       <w:pPr>
         <w:numPr>
           <w:ilvl w:val="0"/>
-          <w:numId w:val="4"/>
+          <w:numId w:val="6"/>
         </w:numPr>
         <w:spacing w:lineRule="auto"/>
       </w:pPr>
@@ -6637,7 +7631,7 @@
       <w:pPr>
         <w:numPr>
           <w:ilvl w:val="0"/>
-          <w:numId w:val="4"/>
+          <w:numId w:val="6"/>
         </w:numPr>
         <w:spacing w:lineRule="auto"/>
       </w:pPr>
@@ -6656,7 +7650,7 @@
       <w:pPr>
         <w:numPr>
           <w:ilvl w:val="0"/>
-          <w:numId w:val="4"/>
+          <w:numId w:val="6"/>
         </w:numPr>
         <w:spacing w:lineRule="auto"/>
       </w:pPr>
@@ -6693,8 +7687,8 @@
         <w:jc w:val="center"/>
       </w:tblPr>
       <w:tblGrid>
-        <w:gridCol w:w="5320"/>
-        <w:gridCol w:w="5320"/>
+        <w:gridCol w:w="5400"/>
+        <w:gridCol w:w="5400"/>
       </w:tblGrid>
       <w:tr>
         <w:trPr>
@@ -7078,7 +8072,45 @@
             </w:pPr>
             <w:r>
               <w:rPr/>
-              <w:t xml:space="preserve">Muro de publicaciones con imágenes y autor.</w:t>
+              <w:t xml:space="preserve">Muro de publicaciones con imágenes y autor. Se suscribe a </w:t>
+            </w:r>
+          </w:p>
+          <w:p>
+            <w:pPr>
+              <w:spacing w:lineRule="auto"/>
+            </w:pPr>
+            <w:r>
+              <w:rPr/>
+              <w:t xml:space="preserve">/api/eventos</w:t>
+            </w:r>
+          </w:p>
+          <w:p>
+            <w:pPr>
+              <w:spacing w:lineRule="auto"/>
+            </w:pPr>
+            <w:r>
+              <w:rPr/>
+              <w:t xml:space="preserve"> (EventSource): si llega una publicación nueva muestra el aviso «Hay N publicaciones nuevas en el muro» con un botón </w:t>
+            </w:r>
+          </w:p>
+          <w:p>
+            <w:pPr>
+              <w:spacing w:lineRule="auto"/>
+            </w:pPr>
+            <w:r>
+              <w:rPr>
+                <w:b/>
+              </w:rPr>
+              <w:t xml:space="preserve">Ver ahora</w:t>
+            </w:r>
+          </w:p>
+          <w:p>
+            <w:pPr>
+              <w:spacing w:lineRule="auto"/>
+            </w:pPr>
+            <w:r>
+              <w:rPr/>
+              <w:t xml:space="preserve"> que actualiza la lista; las ediciones y borrados de otros usuarios se sincronizan solos. Las publicaciones propias no generan el aviso.</w:t>
             </w:r>
           </w:p>
         </w:tc>
@@ -7102,26 +8134,46 @@
             </w:pPr>
             <w:r>
               <w:rPr/>
-              <w:t xml:space="preserve">Perfil</w:t>
-            </w:r>
-          </w:p>
-        </w:tc>
-        <w:tc>
-          <w:tcPr>
-            <w:tcBorders>
-              <w:top w:val="single" w:sz="1" w:space="0" w:color="000000"/>
-              <w:bottom w:val="single" w:sz="1" w:space="0" w:color="000000"/>
-              <w:left w:val="single" w:sz="1" w:space="0" w:color="000000"/>
-              <w:right w:val="single" w:sz="1" w:space="0" w:color="000000"/>
-            </w:tcBorders>
-          </w:tcPr>
-          <w:p>
-            <w:pPr>
-              <w:spacing w:lineRule="auto"/>
-            </w:pPr>
-            <w:r>
-              <w:rPr/>
-              <w:t xml:space="preserve">Datos personales y edición.</w:t>
+              <w:t xml:space="preserve">PoliticaPrivacidad</w:t>
+            </w:r>
+          </w:p>
+        </w:tc>
+        <w:tc>
+          <w:tcPr>
+            <w:tcBorders>
+              <w:top w:val="single" w:sz="1" w:space="0" w:color="000000"/>
+              <w:bottom w:val="single" w:sz="1" w:space="0" w:color="000000"/>
+              <w:left w:val="single" w:sz="1" w:space="0" w:color="000000"/>
+              <w:right w:val="single" w:sz="1" w:space="0" w:color="000000"/>
+            </w:tcBorders>
+          </w:tcPr>
+          <w:p>
+            <w:pPr>
+              <w:spacing w:lineRule="auto"/>
+            </w:pPr>
+            <w:r>
+              <w:rPr/>
+              <w:t xml:space="preserve">Política de privacidad (también disponible como HTML estático en </w:t>
+            </w:r>
+          </w:p>
+          <w:p>
+            <w:pPr>
+              <w:spacing w:lineRule="auto"/>
+            </w:pPr>
+            <w:r>
+              <w:rPr>
+                <w:highlight w:val="lightGray"/>
+              </w:rPr>
+              <w:t xml:space="preserve">/politica-de-privacidad.html</w:t>
+            </w:r>
+          </w:p>
+          <w:p>
+            <w:pPr>
+              <w:spacing w:lineRule="auto"/>
+            </w:pPr>
+            <w:r>
+              <w:rPr/>
+              <w:t xml:space="preserve">).</w:t>
             </w:r>
           </w:p>
         </w:tc>
@@ -7145,6 +8197,49 @@
             </w:pPr>
             <w:r>
               <w:rPr/>
+              <w:t xml:space="preserve">Perfil</w:t>
+            </w:r>
+          </w:p>
+        </w:tc>
+        <w:tc>
+          <w:tcPr>
+            <w:tcBorders>
+              <w:top w:val="single" w:sz="1" w:space="0" w:color="000000"/>
+              <w:bottom w:val="single" w:sz="1" w:space="0" w:color="000000"/>
+              <w:left w:val="single" w:sz="1" w:space="0" w:color="000000"/>
+              <w:right w:val="single" w:sz="1" w:space="0" w:color="000000"/>
+            </w:tcBorders>
+          </w:tcPr>
+          <w:p>
+            <w:pPr>
+              <w:spacing w:lineRule="auto"/>
+            </w:pPr>
+            <w:r>
+              <w:rPr/>
+              <w:t xml:space="preserve">Datos personales y edición.</w:t>
+            </w:r>
+          </w:p>
+        </w:tc>
+      </w:tr>
+      <w:tr>
+        <w:trPr>
+          <w:cantSplit/>
+        </w:trPr>
+        <w:tc>
+          <w:tcPr>
+            <w:tcBorders>
+              <w:top w:val="single" w:sz="1" w:space="0" w:color="000000"/>
+              <w:bottom w:val="single" w:sz="1" w:space="0" w:color="000000"/>
+              <w:left w:val="single" w:sz="1" w:space="0" w:color="000000"/>
+              <w:right w:val="single" w:sz="1" w:space="0" w:color="000000"/>
+            </w:tcBorders>
+          </w:tcPr>
+          <w:p>
+            <w:pPr>
+              <w:spacing w:lineRule="auto"/>
+            </w:pPr>
+            <w:r>
+              <w:rPr/>
               <w:t xml:space="preserve">Admin</w:t>
             </w:r>
           </w:p>
@@ -7222,7 +8317,15 @@
       </w:r>
       <w:r>
         <w:rPr/>
-        <w:t xml:space="preserve">. En la app nativa se compila apuntando a </w:t>
+        <w:t xml:space="preserve">. La conexión SSE usa el mismo origen (</w:t>
+      </w:r>
+      <w:r>
+        <w:rPr/>
+        <w:t xml:space="preserve">BACKEND_ORIGIN</w:t>
+      </w:r>
+      <w:r>
+        <w:rPr/>
+        <w:t xml:space="preserve">). En la app nativa se compila apuntando a </w:t>
       </w:r>
       <w:r>
         <w:rPr/>
@@ -7230,7 +8333,7 @@
       </w:r>
       <w:r>
         <w:rPr/>
-        <w:t xml:space="preserve">.</w:t>
+        <w:t xml:space="preserve">.  </w:t>
       </w:r>
     </w:p>
     <w:p>
@@ -7247,7 +8350,7 @@
       <w:pPr>
         <w:numPr>
           <w:ilvl w:val="0"/>
-          <w:numId w:val="5"/>
+          <w:numId w:val="7"/>
         </w:numPr>
         <w:spacing w:lineRule="auto"/>
       </w:pPr>
@@ -7286,7 +8389,7 @@
       <w:pPr>
         <w:numPr>
           <w:ilvl w:val="0"/>
-          <w:numId w:val="5"/>
+          <w:numId w:val="7"/>
         </w:numPr>
         <w:spacing w:lineRule="auto"/>
       </w:pPr>
@@ -7321,7 +8424,7 @@
       <w:pPr>
         <w:numPr>
           <w:ilvl w:val="0"/>
-          <w:numId w:val="5"/>
+          <w:numId w:val="7"/>
         </w:numPr>
         <w:spacing w:lineRule="auto"/>
       </w:pPr>
@@ -7341,14 +8444,132 @@
       </w:r>
       <w:r>
         <w:rPr/>
-        <w:t xml:space="preserve"> (firmado en debug, instalable).</w:t>
+        <w:t xml:space="preserve"> (firmado en debug, instalable) y los artefactos release.</w:t>
       </w:r>
     </w:p>
     <w:p>
       <w:pPr>
         <w:numPr>
           <w:ilvl w:val="0"/>
-          <w:numId w:val="5"/>
+          <w:numId w:val="7"/>
+        </w:numPr>
+        <w:spacing w:lineRule="auto"/>
+      </w:pPr>
+      <w:r>
+        <w:rPr>
+          <w:b/>
+        </w:rPr>
+        <w:t xml:space="preserve">Firma release:</w:t>
+      </w:r>
+      <w:r>
+        <w:rPr/>
+        <w:t xml:space="preserve"> keystore propio (</w:t>
+      </w:r>
+      <w:r>
+        <w:rPr/>
+        <w:t xml:space="preserve">frontend/android/requintu-release.jks</w:t>
+      </w:r>
+      <w:r>
+        <w:rPr/>
+        <w:t xml:space="preserve">, alias </w:t>
+      </w:r>
+      <w:r>
+        <w:rPr/>
+        <w:t xml:space="preserve">requintu</w:t>
+      </w:r>
+      <w:r>
+        <w:rPr/>
+        <w:t xml:space="preserve">) leído desde </w:t>
+      </w:r>
+      <w:r>
+        <w:rPr/>
+        <w:t xml:space="preserve">keystore.properties</w:t>
+      </w:r>
+      <w:r>
+        <w:rPr/>
+        <w:t xml:space="preserve"> por </w:t>
+      </w:r>
+      <w:r>
+        <w:rPr/>
+        <w:t xml:space="preserve">app/build.gradle</w:t>
+      </w:r>
+      <w:r>
+        <w:rPr/>
+        <w:t xml:space="preserve">; certificado de subida </w:t>
+      </w:r>
+      <w:r>
+        <w:rPr/>
+        <w:t xml:space="preserve">upload_certificate.der</w:t>
+      </w:r>
+      <w:r>
+        <w:rPr/>
+        <w:t xml:space="preserve">. Ambos están excluidos de git.</w:t>
+      </w:r>
+    </w:p>
+    <w:p>
+      <w:pPr>
+        <w:numPr>
+          <w:ilvl w:val="0"/>
+          <w:numId w:val="7"/>
+        </w:numPr>
+        <w:spacing w:lineRule="auto"/>
+      </w:pPr>
+      <w:r>
+        <w:rPr>
+          <w:b/>
+        </w:rPr>
+        <w:t xml:space="preserve">Artefactos entregables:</w:t>
+      </w:r>
+      <w:r>
+        <w:rPr/>
+        <w:t xml:space="preserve"> en la raíz del repositorio: </w:t>
+      </w:r>
+      <w:r>
+        <w:rPr/>
+        <w:t xml:space="preserve">Requintu-app-release.aab</w:t>
+      </w:r>
+      <w:r>
+        <w:rPr/>
+        <w:t xml:space="preserve"> (para Google Play, verificado con apksigner), </w:t>
+      </w:r>
+      <w:r>
+        <w:rPr/>
+        <w:t xml:space="preserve">Requintu-app-release.apk</w:t>
+      </w:r>
+      <w:r>
+        <w:rPr/>
+        <w:t xml:space="preserve">, </w:t>
+      </w:r>
+      <w:r>
+        <w:rPr/>
+        <w:t xml:space="preserve">Requintu-app-debug.apk</w:t>
+      </w:r>
+      <w:r>
+        <w:rPr/>
+        <w:t xml:space="preserve"> e iconos para la ficha de Play (</w:t>
+      </w:r>
+      <w:r>
+        <w:rPr/>
+        <w:t xml:space="preserve">Requintu-icono-play-512.png</w:t>
+      </w:r>
+      <w:r>
+        <w:rPr/>
+        <w:t xml:space="preserve">, </w:t>
+      </w:r>
+      <w:r>
+        <w:rPr/>
+        <w:t xml:space="preserve">Requintu-feature-graphic-1024x500.png</w:t>
+      </w:r>
+      <w:r>
+        <w:rPr/>
+        <w:t xml:space="preserve">).</w:t>
+      </w:r>
+    </w:p>
+    <w:p>
+      <w:pPr>
+        <w:numPr>
+          <w:ilvl w:val="0"/>
+          <w:numId w:val="7"/>
         </w:numPr>
         <w:spacing w:lineRule="auto"/>
       </w:pPr>
@@ -7367,7 +8588,7 @@
       <w:pPr>
         <w:numPr>
           <w:ilvl w:val="0"/>
-          <w:numId w:val="5"/>
+          <w:numId w:val="7"/>
         </w:numPr>
         <w:spacing w:lineRule="auto"/>
       </w:pPr>
@@ -7394,7 +8615,7 @@
       <w:pPr>
         <w:numPr>
           <w:ilvl w:val="0"/>
-          <w:numId w:val="5"/>
+          <w:numId w:val="7"/>
         </w:numPr>
         <w:spacing w:lineRule="auto"/>
       </w:pPr>
@@ -7449,7 +8670,7 @@
       <w:pPr>
         <w:numPr>
           <w:ilvl w:val="0"/>
-          <w:numId w:val="6"/>
+          <w:numId w:val="8"/>
         </w:numPr>
         <w:spacing w:lineRule="auto"/>
       </w:pPr>
@@ -7472,371 +8693,6 @@
       <w:r>
         <w:rPr/>
         <w:t xml:space="preserve">.</w:t>
-      </w:r>
-    </w:p>
-    <w:p>
-      <w:pPr>
-        <w:numPr>
-          <w:ilvl w:val="0"/>
-          <w:numId w:val="6"/>
-        </w:numPr>
-        <w:spacing w:lineRule="auto"/>
-      </w:pPr>
-      <w:r>
-        <w:rPr/>
-        <w:t xml:space="preserve">Comando de inicio: </w:t>
-      </w:r>
-      <w:r>
-        <w:rPr/>
-        <w:t xml:space="preserve">npm start</w:t>
-      </w:r>
-      <w:r>
-        <w:rPr/>
-        <w:t xml:space="preserve">. Requiere </w:t>
-      </w:r>
-      <w:r>
-        <w:rPr/>
-        <w:t xml:space="preserve">NODE_ENV=production</w:t>
-      </w:r>
-      <w:r>
-        <w:rPr/>
-        <w:t xml:space="preserve"> y las variables de entorno según .env.example.</w:t>
-      </w:r>
-    </w:p>
-    <w:p>
-      <w:pPr>
-        <w:numPr>
-          <w:ilvl w:val="0"/>
-          <w:numId w:val="6"/>
-        </w:numPr>
-        <w:spacing w:lineRule="auto"/>
-      </w:pPr>
-      <w:r>
-        <w:rPr/>
-        <w:t xml:space="preserve">El proceso valida </w:t>
-      </w:r>
-      <w:r>
-        <w:rPr/>
-        <w:t xml:space="preserve">JWT_SECRET</w:t>
-      </w:r>
-      <w:r>
-        <w:rPr/>
-        <w:t xml:space="preserve"> al arrancar y verifica la conexión a la BD.</w:t>
-      </w:r>
-    </w:p>
-    <w:p>
-      <w:pPr>
-        <w:pStyle w:val="Heading2"/>
-        <w:spacing w:lineRule="auto"/>
-      </w:pPr>
-      <w:r>
-        <w:rPr/>
-        <w:t xml:space="preserve">10.2 Frontend (Vercel)</w:t>
-      </w:r>
-    </w:p>
-    <w:p>
-      <w:pPr>
-        <w:numPr>
-          <w:ilvl w:val="0"/>
-          <w:numId w:val="7"/>
-        </w:numPr>
-        <w:spacing w:lineRule="auto"/>
-      </w:pPr>
-      <w:r>
-        <w:rPr/>
-        <w:t xml:space="preserve">URL: </w:t>
-      </w:r>
-      <w:r>
-        <w:rPr/>
-        <w:t xml:space="preserve">https://requintu.vercel.app</w:t>
-      </w:r>
-      <w:r>
-        <w:rPr/>
-        <w:t xml:space="preserve">. Se despliega desde la rama </w:t>
-      </w:r>
-      <w:r>
-        <w:rPr/>
-        <w:t xml:space="preserve">main</w:t>
-      </w:r>
-      <w:r>
-        <w:rPr/>
-        <w:t xml:space="preserve"> de GitHub (push automático).</w:t>
-      </w:r>
-    </w:p>
-    <w:p>
-      <w:pPr>
-        <w:numPr>
-          <w:ilvl w:val="0"/>
-          <w:numId w:val="7"/>
-        </w:numPr>
-        <w:spacing w:lineRule="auto"/>
-      </w:pPr>
-      <w:r>
-        <w:rPr/>
-        <w:t xml:space="preserve">vercel.json</w:t>
-      </w:r>
-      <w:r>
-        <w:rPr/>
-        <w:t xml:space="preserve">: framework Vite, build </w:t>
-      </w:r>
-      <w:r>
-        <w:rPr/>
-        <w:t xml:space="preserve">npm run build</w:t>
-      </w:r>
-      <w:r>
-        <w:rPr/>
-        <w:t xml:space="preserve">, </w:t>
-      </w:r>
-      <w:r>
-        <w:rPr/>
-        <w:t xml:space="preserve">outputDirectory: dist</w:t>
-      </w:r>
-      <w:r>
-        <w:rPr/>
-        <w:t xml:space="preserve"> y </w:t>
-      </w:r>
-      <w:r>
-        <w:rPr>
-          <w:b/>
-        </w:rPr>
-        <w:t xml:space="preserve">rewrites SPA</w:t>
-      </w:r>
-      <w:r>
-        <w:rPr/>
-        <w:t xml:space="preserve">/(.*) → /index.html</w:t>
-      </w:r>
-      <w:r>
-        <w:rPr/>
-        <w:t xml:space="preserve">.</w:t>
-      </w:r>
-    </w:p>
-    <w:p>
-      <w:pPr>
-        <w:numPr>
-          <w:ilvl w:val="0"/>
-          <w:numId w:val="7"/>
-        </w:numPr>
-        <w:spacing w:lineRule="auto"/>
-      </w:pPr>
-      <w:r>
-        <w:rPr/>
-        <w:t xml:space="preserve">Variable de compilación: </w:t>
-      </w:r>
-      <w:r>
-        <w:rPr/>
-        <w:t xml:space="preserve">VITE_BACKEND_ORIGIN=https://requintu-1.onrender.com</w:t>
-      </w:r>
-      <w:r>
-        <w:rPr/>
-        <w:t xml:space="preserve">.</w:t>
-      </w:r>
-    </w:p>
-    <w:p>
-      <w:pPr>
-        <w:numPr>
-          <w:ilvl w:val="0"/>
-          <w:numId w:val="7"/>
-        </w:numPr>
-        <w:spacing w:lineRule="auto"/>
-      </w:pPr>
-      <w:r>
-        <w:rPr/>
-        <w:t xml:space="preserve">Nota: la PWA (service worker) se desactivó a propósito para que la web cargue siempre la versión más reciente.</w:t>
-      </w:r>
-    </w:p>
-    <w:p>
-      <w:pPr>
-        <w:pStyle w:val="Heading2"/>
-        <w:spacing w:lineRule="auto"/>
-      </w:pPr>
-      <w:r>
-        <w:rPr/>
-        <w:t xml:space="preserve">10.3 Netlify (alternativa)</w:t>
-      </w:r>
-    </w:p>
-    <w:p>
-      <w:pPr>
-        <w:spacing w:lineRule="auto"/>
-      </w:pPr>
-      <w:r>
-        <w:rPr/>
-        <w:t xml:space="preserve">netlify.toml</w:t>
-      </w:r>
-      <w:r>
-        <w:rPr/>
-        <w:t xml:space="preserve"> define el build en </w:t>
-      </w:r>
-      <w:r>
-        <w:rPr/>
-        <w:t xml:space="preserve">frontend</w:t>
-      </w:r>
-      <w:r>
-        <w:rPr/>
-        <w:t xml:space="preserve"> y un redirect SPA </w:t>
-      </w:r>
-      <w:r>
-        <w:rPr/>
-        <w:t xml:space="preserve">/* → /index.html</w:t>
-      </w:r>
-      <w:r>
-        <w:rPr/>
-        <w:t xml:space="preserve">.</w:t>
-      </w:r>
-    </w:p>
-    <w:p>
-      <w:pPr>
-        <w:pStyle w:val="Heading2"/>
-        <w:spacing w:lineRule="auto"/>
-      </w:pPr>
-      <w:r>
-        <w:rPr/>
-        <w:t xml:space="preserve">10.4 Base de datos (TiDB Cloud)</w:t>
-      </w:r>
-    </w:p>
-    <w:p>
-      <w:pPr>
-        <w:spacing w:lineRule="auto"/>
-      </w:pPr>
-      <w:r>
-        <w:rPr/>
-        <w:t xml:space="preserve">MySQL en la nube, host </w:t>
-      </w:r>
-      <w:r>
-        <w:rPr/>
-        <w:t xml:space="preserve">gateway01.us-east-1.prod.aws.tidbcloud.com</w:t>
-      </w:r>
-      <w:r>
-        <w:rPr/>
-        <w:t xml:space="preserve">, puerto 4000, con SSL configurado </w:t>
-      </w:r>
-      <w:r>
-        <w:rPr/>
-        <w:t xml:space="preserve">rejectUnauthorized: true</w:t>
-      </w:r>
-      <w:r>
-        <w:rPr/>
-        <w:t xml:space="preserve">.</w:t>
-      </w:r>
-    </w:p>
-    <w:p>
-      <w:pPr>
-        <w:pStyle w:val="Heading1"/>
-        <w:spacing w:lineRule="auto"/>
-      </w:pPr>
-      <w:r>
-        <w:rPr/>
-        <w:t xml:space="preserve">11. Variables de entorno</w:t>
-      </w:r>
-    </w:p>
-    <w:p>
-      <w:pPr>
-        <w:spacing w:lineRule="auto"/>
-      </w:pPr>
-      <w:r>
-        <w:rPr>
-          <w:rFonts w:ascii="Courier" w:hAnsi="Courier"/>
-        </w:rPr>
-        <w:t xml:space="preserve"> NODE_ENV=production|development JWT_SECRET=&lt;secreto largo&gt; DB_HOST, DB_USER, DB_PASSWORD, DB_NAME, DB_SSL CORS_ORIGINS=&lt;orígenes extra separados por coma&gt; RATE_LIMIT_API_MAX, RATE_LIMIT_AUTH_MAX BREVO_API_KEY, BREVO_SENDER_EMAIL APP_URL=&lt;URL pública del frontend&gt; PORT CLOUDINARY_CLOUD_NAME, CLOUDINARY_API_KEY, CLOUDINARY_API_SECRET VITE_BACKEND_ORIGIN=&lt;frontend, en compilación&gt; </w:t>
-      </w:r>
-    </w:p>
-    <w:p>
-      <w:pPr>
-        <w:spacing w:lineRule="auto"/>
-      </w:pPr>
-      <w:r>
-        <w:rPr/>
-        <w:t xml:space="preserve">Advertencia: el archivo </w:t>
-      </w:r>
-      <w:r>
-        <w:rPr/>
-        <w:t xml:space="preserve">.env</w:t>
-      </w:r>
-      <w:r>
-        <w:rPr/>
-        <w:t xml:space="preserve"> real no debe subirse a git (está ignorado).</w:t>
-      </w:r>
-    </w:p>
-    <w:p>
-      <w:pPr>
-        <w:pStyle w:val="Heading1"/>
-        <w:spacing w:lineRule="auto"/>
-      </w:pPr>
-      <w:r>
-        <w:rPr/>
-        <w:t xml:space="preserve">12. Ejecución local</w:t>
-      </w:r>
-    </w:p>
-    <w:p>
-      <w:pPr>
-        <w:pStyle w:val="Heading2"/>
-        <w:spacing w:lineRule="auto"/>
-      </w:pPr>
-      <w:r>
-        <w:rPr/>
-        <w:t xml:space="preserve">12.1 Backend</w:t>
-      </w:r>
-    </w:p>
-    <w:p>
-      <w:pPr>
-        <w:spacing w:lineRule="auto"/>
-      </w:pPr>
-      <w:r>
-        <w:rPr>
-          <w:rFonts w:ascii="Courier" w:hAnsi="Courier"/>
-        </w:rPr>
-        <w:t xml:space="preserve"> npm install cp .env.example .env   # completar valores (BD, JWT, Cloudinary, Brevo) npm run dev            # o npm start </w:t>
-      </w:r>
-    </w:p>
-    <w:p>
-      <w:pPr>
-        <w:pStyle w:val="Heading2"/>
-        <w:spacing w:lineRule="auto"/>
-      </w:pPr>
-      <w:r>
-        <w:rPr/>
-        <w:t xml:space="preserve">12.2 Frontend</w:t>
-      </w:r>
-    </w:p>
-    <w:p>
-      <w:pPr>
-        <w:spacing w:lineRule="auto"/>
-      </w:pPr>
-      <w:r>
-        <w:rPr>
-          <w:rFonts w:ascii="Courier" w:hAnsi="Courier"/>
-        </w:rPr>
-        <w:t xml:space="preserve"> cd frontend npm install npm run dev            # Vite (puerto 5173) npm run lint           # oxlint npm run build          # compilación de producción </w:t>
-      </w:r>
-    </w:p>
-    <w:p>
-      <w:pPr>
-        <w:pStyle w:val="Heading2"/>
-        <w:spacing w:lineRule="auto"/>
-      </w:pPr>
-      <w:r>
-        <w:rPr/>
-        <w:t xml:space="preserve">12.3 App Android</w:t>
-      </w:r>
-    </w:p>
-    <w:p>
-      <w:pPr>
-        <w:spacing w:lineRule="auto"/>
-      </w:pPr>
-      <w:r>
-        <w:rPr>
-          <w:rFonts w:ascii="Courier" w:hAnsi="Courier"/>
-        </w:rPr>
-        <w:t xml:space="preserve"> cd frontend VITE_BACKEND_ORIGIN=https://requintu-1.onrender.com npm run build npx cap sync android cd android JAVA_HOME=&lt;jdk 21&gt; ANDROID_HOME=&lt;sdk&gt; ./gradlew assembleDebug # APK en android/app/build/outputs/apk/debug/app-debug.apk </w:t>
-      </w:r>
-    </w:p>
-    <w:p>
-      <w:pPr>
-        <w:pStyle w:val="Heading1"/>
-        <w:spacing w:lineRule="auto"/>
-      </w:pPr>
-      <w:r>
-        <w:rPr/>
-        <w:t xml:space="preserve">13. Seguridad y buenas prácticas aplicadas</w:t>
       </w:r>
     </w:p>
     <w:p>
@@ -7849,7 +8705,23 @@
       </w:pPr>
       <w:r>
         <w:rPr/>
-        <w:t xml:space="preserve">Contraseñas con bcrypt y tokens JWT con expiración corta, + refresh tokens rotatorios en cookie httpOnly (mitigan robo y reuso).</w:t>
+        <w:t xml:space="preserve">Comando de inicio: </w:t>
+      </w:r>
+      <w:r>
+        <w:rPr/>
+        <w:t xml:space="preserve">npm start</w:t>
+      </w:r>
+      <w:r>
+        <w:rPr/>
+        <w:t xml:space="preserve">. Requiere </w:t>
+      </w:r>
+      <w:r>
+        <w:rPr/>
+        <w:t xml:space="preserve">NODE_ENV=production</w:t>
+      </w:r>
+      <w:r>
+        <w:rPr/>
+        <w:t xml:space="preserve"> y las variables de entorno según .env.example.</w:t>
       </w:r>
     </w:p>
     <w:p>
@@ -7862,7 +8734,15 @@
       </w:pPr>
       <w:r>
         <w:rPr/>
-        <w:t xml:space="preserve">Cabeceras de seguridad (helmet/HSTS), HTTPS forzado y CORS por lista blanca.</w:t>
+        <w:t xml:space="preserve">El proceso valida </w:t>
+      </w:r>
+      <w:r>
+        <w:rPr/>
+        <w:t xml:space="preserve">JWT_SECRET</w:t>
+      </w:r>
+      <w:r>
+        <w:rPr/>
+        <w:t xml:space="preserve"> al arrancar, verifica la conexión a la BD y levanta la cola de correos.</w:t>
       </w:r>
     </w:p>
     <w:p>
@@ -7875,82 +8755,17 @@
       </w:pPr>
       <w:r>
         <w:rPr/>
-        <w:t xml:space="preserve">Rate limiting por IP en API y autenticación.</w:t>
-      </w:r>
-    </w:p>
-    <w:p>
-      <w:pPr>
-        <w:numPr>
-          <w:ilvl w:val="0"/>
-          <w:numId w:val="8"/>
-        </w:numPr>
-        <w:spacing w:lineRule="auto"/>
-      </w:pPr>
-      <w:r>
-        <w:rPr/>
-        <w:t xml:space="preserve">Validación de entradas y saneamiento en todas las rutas de escritura.</w:t>
-      </w:r>
-    </w:p>
-    <w:p>
-      <w:pPr>
-        <w:numPr>
-          <w:ilvl w:val="0"/>
-          <w:numId w:val="8"/>
-        </w:numPr>
-        <w:spacing w:lineRule="auto"/>
-      </w:pPr>
-      <w:r>
-        <w:rPr/>
-        <w:t xml:space="preserve">Filtro de lenguaje inapropiado para contenido generado por usuarios.</w:t>
-      </w:r>
-    </w:p>
-    <w:p>
-      <w:pPr>
-        <w:numPr>
-          <w:ilvl w:val="0"/>
-          <w:numId w:val="8"/>
-        </w:numPr>
-        <w:spacing w:lineRule="auto"/>
-      </w:pPr>
-      <w:r>
-        <w:rPr/>
-        <w:t xml:space="preserve">Restricción de subidas de archivos por formato y tamaño.</w:t>
-      </w:r>
-    </w:p>
-    <w:p>
-      <w:pPr>
-        <w:numPr>
-          <w:ilvl w:val="0"/>
-          <w:numId w:val="8"/>
-        </w:numPr>
-        <w:spacing w:lineRule="auto"/>
-      </w:pPr>
-      <w:r>
-        <w:rPr/>
-        <w:t xml:space="preserve">Variables sensibles únicamente en variables de entorno (nunca en el repositorio).</w:t>
-      </w:r>
-    </w:p>
-    <w:p>
-      <w:pPr>
-        <w:numPr>
-          <w:ilvl w:val="0"/>
-          <w:numId w:val="8"/>
-        </w:numPr>
-        <w:spacing w:lineRule="auto"/>
-      </w:pPr>
-      <w:r>
-        <w:rPr/>
-        <w:t xml:space="preserve">Verificación de unicidad del nombre de un local dentro de su municipio.</w:t>
-      </w:r>
-    </w:p>
-    <w:p>
-      <w:pPr>
-        <w:pStyle w:val="Heading1"/>
-        <w:spacing w:lineRule="auto"/>
-      </w:pPr>
-      <w:r>
-        <w:rPr/>
-        <w:t xml:space="preserve">14. Mejoras futuras sugeridas</w:t>
+        <w:t xml:space="preserve">Soporta conexiones SSE (heartbeat de 25 s para mantenerlas vivas en el proxy).</w:t>
+      </w:r>
+    </w:p>
+    <w:p>
+      <w:pPr>
+        <w:pStyle w:val="Heading2"/>
+        <w:spacing w:lineRule="auto"/>
+      </w:pPr>
+      <w:r>
+        <w:rPr/>
+        <w:t xml:space="preserve">10.2 Frontend (Vercel)</w:t>
       </w:r>
     </w:p>
     <w:p>
@@ -7963,17 +8778,23 @@
       </w:pPr>
       <w:r>
         <w:rPr/>
-        <w:t xml:space="preserve">Firma </w:t>
-      </w:r>
-      <w:r>
-        <w:rPr>
-          <w:b/>
-        </w:rPr>
-        <w:t xml:space="preserve">release</w:t>
-      </w:r>
-      <w:r>
-        <w:rPr/>
-        <w:t xml:space="preserve"> del APK y publicación en Google Play.</w:t>
+        <w:t xml:space="preserve">URL: </w:t>
+      </w:r>
+      <w:r>
+        <w:rPr/>
+        <w:t xml:space="preserve">https://requintu.vercel.app</w:t>
+      </w:r>
+      <w:r>
+        <w:rPr/>
+        <w:t xml:space="preserve">. Se despliega desde la rama </w:t>
+      </w:r>
+      <w:r>
+        <w:rPr/>
+        <w:t xml:space="preserve">main</w:t>
+      </w:r>
+      <w:r>
+        <w:rPr/>
+        <w:t xml:space="preserve"> de GitHub (push automático).</w:t>
       </w:r>
     </w:p>
     <w:p>
@@ -7986,15 +8807,57 @@
       </w:pPr>
       <w:r>
         <w:rPr/>
-        <w:t xml:space="preserve">Pruebas automatizadas en el backend (script </w:t>
-      </w:r>
-      <w:r>
-        <w:rPr/>
-        <w:t xml:space="preserve">npm test</w:t>
-      </w:r>
-      <w:r>
-        <w:rPr/>
-        <w:t xml:space="preserve"> definido) y test e2e del frontend.</w:t>
+        <w:t xml:space="preserve">Configuración en </w:t>
+      </w:r>
+      <w:r>
+        <w:rPr/>
+        <w:t xml:space="preserve">frontend/vercel.json</w:t>
+      </w:r>
+      <w:r>
+        <w:rPr/>
+        <w:t xml:space="preserve">; en Vercel el </w:t>
+      </w:r>
+      <w:r>
+        <w:rPr>
+          <w:b/>
+        </w:rPr>
+        <w:t xml:space="preserve">Root Directory</w:t>
+      </w:r>
+      <w:r>
+        <w:rPr/>
+        <w:t xml:space="preserve"> se apunta a </w:t>
+      </w:r>
+      <w:r>
+        <w:rPr/>
+        <w:t xml:space="preserve">frontend</w:t>
+      </w:r>
+      <w:r>
+        <w:rPr/>
+        <w:t xml:space="preserve"> (donde vive el </w:t>
+      </w:r>
+      <w:r>
+        <w:rPr/>
+        <w:t xml:space="preserve">package.json</w:t>
+      </w:r>
+      <w:r>
+        <w:rPr/>
+        <w:t xml:space="preserve"> con el script </w:t>
+      </w:r>
+      <w:r>
+        <w:rPr/>
+        <w:t xml:space="preserve">build</w:t>
+      </w:r>
+      <w:r>
+        <w:rPr/>
+        <w:t xml:space="preserve">). Incluye los rewrites de la política de privacidad y el wildcard SPA </w:t>
+      </w:r>
+      <w:r>
+        <w:rPr/>
+        <w:t xml:space="preserve">/(.*) → /index.html</w:t>
+      </w:r>
+      <w:r>
+        <w:rPr/>
+        <w:t xml:space="preserve">.</w:t>
       </w:r>
     </w:p>
     <w:p>
@@ -8007,7 +8870,15 @@
       </w:pPr>
       <w:r>
         <w:rPr/>
-        <w:t xml:space="preserve">WebSockets o notificaciones push para avisos del muro.</w:t>
+        <w:t xml:space="preserve">Variable de compilación: </w:t>
+      </w:r>
+      <w:r>
+        <w:rPr/>
+        <w:t xml:space="preserve">VITE_BACKEND_ORIGIN=https://requintu-1.onrender.com</w:t>
+      </w:r>
+      <w:r>
+        <w:rPr/>
+        <w:t xml:space="preserve">.</w:t>
       </w:r>
     </w:p>
     <w:p>
@@ -8020,33 +8891,81 @@
       </w:pPr>
       <w:r>
         <w:rPr/>
-        <w:t xml:space="preserve">Moderación manual de locales antes de publicarlos (flujo de aprobación).</w:t>
-      </w:r>
-    </w:p>
-    <w:p>
-      <w:pPr>
-        <w:numPr>
-          <w:ilvl w:val="0"/>
-          <w:numId w:val="9"/>
-        </w:numPr>
-        <w:spacing w:lineRule="auto"/>
-      </w:pPr>
-      <w:r>
-        <w:rPr/>
-        <w:t xml:space="preserve">Reintentos y cola de envío de correos (Brevo) para mayor robustez.</w:t>
-      </w:r>
-    </w:p>
-    <w:p>
-      <w:pPr>
-        <w:numPr>
-          <w:ilvl w:val="0"/>
-          <w:numId w:val="9"/>
-        </w:numPr>
-        <w:spacing w:lineRule="auto"/>
-      </w:pPr>
-      <w:r>
-        <w:rPr/>
-        <w:t xml:space="preserve">Migraciones versionadas del esquema (hoy se respalda con dump).</w:t>
+        <w:t xml:space="preserve">Nota: la PWA (service worker) se desactivó a propósito (SW auto-destructivo) para que la web cargue siempre la versión más reciente.</w:t>
+      </w:r>
+    </w:p>
+    <w:p>
+      <w:pPr>
+        <w:pStyle w:val="Heading2"/>
+        <w:spacing w:lineRule="auto"/>
+      </w:pPr>
+      <w:r>
+        <w:rPr/>
+        <w:t xml:space="preserve">10.3 Netlify (alternativa)</w:t>
+      </w:r>
+    </w:p>
+    <w:p>
+      <w:pPr>
+        <w:spacing w:lineRule="auto"/>
+      </w:pPr>
+      <w:r>
+        <w:rPr/>
+        <w:t xml:space="preserve">netlify.toml</w:t>
+      </w:r>
+      <w:r>
+        <w:rPr/>
+        <w:t xml:space="preserve"> define el build en </w:t>
+      </w:r>
+      <w:r>
+        <w:rPr/>
+        <w:t xml:space="preserve">frontend</w:t>
+      </w:r>
+      <w:r>
+        <w:rPr/>
+        <w:t xml:space="preserve"> y un redirect SPA </w:t>
+      </w:r>
+      <w:r>
+        <w:rPr/>
+        <w:t xml:space="preserve">/* → /index.html</w:t>
+      </w:r>
+      <w:r>
+        <w:rPr/>
+        <w:t xml:space="preserve">.</w:t>
+      </w:r>
+    </w:p>
+    <w:p>
+      <w:pPr>
+        <w:pStyle w:val="Heading2"/>
+        <w:spacing w:lineRule="auto"/>
+      </w:pPr>
+      <w:r>
+        <w:rPr/>
+        <w:t xml:space="preserve">10.4 Base de datos (TiDB Cloud)</w:t>
+      </w:r>
+    </w:p>
+    <w:p>
+      <w:pPr>
+        <w:spacing w:lineRule="auto"/>
+      </w:pPr>
+      <w:r>
+        <w:rPr/>
+        <w:t xml:space="preserve">MySQL en la nube, host </w:t>
+      </w:r>
+      <w:r>
+        <w:rPr/>
+        <w:t xml:space="preserve">gateway01.us-east-1.prod.aws.tidbcloud.com</w:t>
+      </w:r>
+      <w:r>
+        <w:rPr/>
+        <w:t xml:space="preserve">, puerto 4000, con SSL configurado </w:t>
+      </w:r>
+      <w:r>
+        <w:rPr/>
+        <w:t xml:space="preserve">rejectUnauthorized: true</w:t>
+      </w:r>
+      <w:r>
+        <w:rPr/>
+        <w:t xml:space="preserve">.</w:t>
       </w:r>
     </w:p>
     <w:p>
@@ -8056,7 +8975,118 @@
       </w:pPr>
       <w:r>
         <w:rPr/>
-        <w:t xml:space="preserve">15. Glosario de rutas del servidor</w:t>
+        <w:t xml:space="preserve">11. Variables de entorno</w:t>
+      </w:r>
+    </w:p>
+    <w:p>
+      <w:pPr>
+        <w:spacing w:lineRule="auto"/>
+      </w:pPr>
+      <w:r>
+        <w:rPr>
+          <w:rFonts w:ascii="Courier" w:hAnsi="Courier"/>
+        </w:rPr>
+        <w:t xml:space="preserve"> NODE_ENV=production|development JWT_SECRET=&lt;secreto largo&gt; DB_HOST, DB_USER, DB_PASSWORD, DB_NAME, DB_SSL CORS_ORIGINS=&lt;orígenes extra separados por coma&gt; RATE_LIMIT_API_MAX, RATE_LIMIT_AUTH_MAX BREVO_API_KEY, BREVO_SENDER_EMAIL EMAIL_MAX_INTENTOS=&lt;reintentos de la cola de correos; por defecto 5&gt; APP_URL=&lt;URL pública del frontend&gt; PORT CLOUDINARY_CLOUD_NAME, CLOUDINARY_API_KEY, CLOUDINARY_API_SECRET VITE_BACKEND_ORIGIN=&lt;frontend, en compilación&gt; </w:t>
+      </w:r>
+    </w:p>
+    <w:p>
+      <w:pPr>
+        <w:spacing w:lineRule="auto"/>
+      </w:pPr>
+      <w:r>
+        <w:rPr/>
+        <w:t xml:space="preserve">Advertencia: el archivo </w:t>
+      </w:r>
+      <w:r>
+        <w:rPr/>
+        <w:t xml:space="preserve">.env</w:t>
+      </w:r>
+      <w:r>
+        <w:rPr/>
+        <w:t xml:space="preserve"> real no debe subirse a git (está ignorado).</w:t>
+      </w:r>
+    </w:p>
+    <w:p>
+      <w:pPr>
+        <w:pStyle w:val="Heading1"/>
+        <w:spacing w:lineRule="auto"/>
+      </w:pPr>
+      <w:r>
+        <w:rPr/>
+        <w:t xml:space="preserve">12. Ejecución local</w:t>
+      </w:r>
+    </w:p>
+    <w:p>
+      <w:pPr>
+        <w:pStyle w:val="Heading2"/>
+        <w:spacing w:lineRule="auto"/>
+      </w:pPr>
+      <w:r>
+        <w:rPr/>
+        <w:t xml:space="preserve">12.1 Backend</w:t>
+      </w:r>
+    </w:p>
+    <w:p>
+      <w:pPr>
+        <w:spacing w:lineRule="auto"/>
+      </w:pPr>
+      <w:r>
+        <w:rPr>
+          <w:rFonts w:ascii="Courier" w:hAnsi="Courier"/>
+        </w:rPr>
+        <w:t xml:space="preserve"> npm install cp .env.example .env   # completar valores (BD, JWT, Cloudinary, Brevo) npm run dev            # o npm start npm test               # 21 pruebas de integración (usa la BD del .env) </w:t>
+      </w:r>
+    </w:p>
+    <w:p>
+      <w:pPr>
+        <w:pStyle w:val="Heading2"/>
+        <w:spacing w:lineRule="auto"/>
+      </w:pPr>
+      <w:r>
+        <w:rPr/>
+        <w:t xml:space="preserve">12.2 Frontend</w:t>
+      </w:r>
+    </w:p>
+    <w:p>
+      <w:pPr>
+        <w:spacing w:lineRule="auto"/>
+      </w:pPr>
+      <w:r>
+        <w:rPr>
+          <w:rFonts w:ascii="Courier" w:hAnsi="Courier"/>
+        </w:rPr>
+        <w:t xml:space="preserve"> cd frontend npm install npm run dev            # Vite (puerto 5173) npm run lint           # oxlint npm run build          # compilación de producción npx playwright install chromium   # solo la primera vez (para e2e) npm run test:e2e       # 9 pruebas e2e (levanta backend local + preview) </w:t>
+      </w:r>
+    </w:p>
+    <w:p>
+      <w:pPr>
+        <w:pStyle w:val="Heading2"/>
+        <w:spacing w:lineRule="auto"/>
+      </w:pPr>
+      <w:r>
+        <w:rPr/>
+        <w:t xml:space="preserve">12.3 App Android</w:t>
+      </w:r>
+    </w:p>
+    <w:p>
+      <w:pPr>
+        <w:spacing w:lineRule="auto"/>
+      </w:pPr>
+      <w:r>
+        <w:rPr>
+          <w:rFonts w:ascii="Courier" w:hAnsi="Courier"/>
+        </w:rPr>
+        <w:t xml:space="preserve"> cd frontend VITE_BACKEND_ORIGIN=https://requintu-1.onrender.com npm run build npx cap sync android cd android JAVA_HOME=&lt;jdk 21&gt; ANDROID_HOME=&lt;sdk&gt; ./gradlew assembleDebug ./gradlew bundleRelease   # o assembleRelease (usa keystore.properties) # APK debug en android/app/build/outputs/apk/debug/app-debug.apk # AAB en android/app/build/outputs/bundle/release/... </w:t>
+      </w:r>
+    </w:p>
+    <w:p>
+      <w:pPr>
+        <w:pStyle w:val="Heading1"/>
+        <w:spacing w:lineRule="auto"/>
+      </w:pPr>
+      <w:r>
+        <w:rPr/>
+        <w:t xml:space="preserve">13. Seguridad y buenas prácticas aplicadas</w:t>
       </w:r>
     </w:p>
     <w:p>
@@ -8069,11 +9099,7 @@
       </w:pPr>
       <w:r>
         <w:rPr/>
-        <w:t xml:space="preserve">/api/*</w:t>
-      </w:r>
-      <w:r>
-        <w:rPr/>
-        <w:t xml:space="preserve"> — API REST.</w:t>
+        <w:t xml:space="preserve">Contraseñas con bcrypt y tokens JWT con expiración corta, + refresh tokens rotatorios en cookie httpOnly (mitigan robo y reuso).</w:t>
       </w:r>
     </w:p>
     <w:p>
@@ -8086,11 +9112,7 @@
       </w:pPr>
       <w:r>
         <w:rPr/>
-        <w:t xml:space="preserve">/uploads/*</w:t>
-      </w:r>
-      <w:r>
-        <w:rPr/>
-        <w:t xml:space="preserve"> — archivos estáticos locales (legacy de imágenes).</w:t>
+        <w:t xml:space="preserve">Cabeceras de seguridad (helmet/HSTS), HTTPS forzado y CORS por lista blanca.</w:t>
       </w:r>
     </w:p>
     <w:p>
@@ -8103,6 +9125,314 @@
       </w:pPr>
       <w:r>
         <w:rPr/>
+        <w:t xml:space="preserve">Rate limiting por IP en API y autenticación.</w:t>
+      </w:r>
+    </w:p>
+    <w:p>
+      <w:pPr>
+        <w:numPr>
+          <w:ilvl w:val="0"/>
+          <w:numId w:val="10"/>
+        </w:numPr>
+        <w:spacing w:lineRule="auto"/>
+      </w:pPr>
+      <w:r>
+        <w:rPr/>
+        <w:t xml:space="preserve">Validación de entradas y saneamiento en todas las rutas de escritura.</w:t>
+      </w:r>
+    </w:p>
+    <w:p>
+      <w:pPr>
+        <w:numPr>
+          <w:ilvl w:val="0"/>
+          <w:numId w:val="10"/>
+        </w:numPr>
+        <w:spacing w:lineRule="auto"/>
+      </w:pPr>
+      <w:r>
+        <w:rPr/>
+        <w:t xml:space="preserve">Filtro de lenguaje inapropiado para contenido generado por usuarios.</w:t>
+      </w:r>
+    </w:p>
+    <w:p>
+      <w:pPr>
+        <w:numPr>
+          <w:ilvl w:val="0"/>
+          <w:numId w:val="10"/>
+        </w:numPr>
+        <w:spacing w:lineRule="auto"/>
+      </w:pPr>
+      <w:r>
+        <w:rPr/>
+        <w:t xml:space="preserve">Restricción de subidas de archivos por formato real (magic bytes), MIME y tamaño.</w:t>
+      </w:r>
+    </w:p>
+    <w:p>
+      <w:pPr>
+        <w:numPr>
+          <w:ilvl w:val="0"/>
+          <w:numId w:val="10"/>
+        </w:numPr>
+        <w:spacing w:lineRule="auto"/>
+      </w:pPr>
+      <w:r>
+        <w:rPr/>
+        <w:t xml:space="preserve">Reintentos y backoff en el envío de correos mediante cola persistida (no se pierden correos ante fallos temporales de Brevo).</w:t>
+      </w:r>
+    </w:p>
+    <w:p>
+      <w:pPr>
+        <w:numPr>
+          <w:ilvl w:val="0"/>
+          <w:numId w:val="10"/>
+        </w:numPr>
+        <w:spacing w:lineRule="auto"/>
+      </w:pPr>
+      <w:r>
+        <w:rPr/>
+        <w:t xml:space="preserve">Variables sensibles únicamente en variables de entorno (nunca en el repositorio).</w:t>
+      </w:r>
+    </w:p>
+    <w:p>
+      <w:pPr>
+        <w:numPr>
+          <w:ilvl w:val="0"/>
+          <w:numId w:val="10"/>
+        </w:numPr>
+        <w:spacing w:lineRule="auto"/>
+      </w:pPr>
+      <w:r>
+        <w:rPr/>
+        <w:t xml:space="preserve">Verificación de unicidad del nombre de un local dentro de su municipio.</w:t>
+      </w:r>
+    </w:p>
+    <w:p>
+      <w:pPr>
+        <w:pStyle w:val="Heading1"/>
+        <w:spacing w:lineRule="auto"/>
+      </w:pPr>
+      <w:r>
+        <w:rPr/>
+        <w:t xml:space="preserve">14. Pruebas automatizadas</w:t>
+      </w:r>
+    </w:p>
+    <w:p>
+      <w:pPr>
+        <w:pStyle w:val="Heading2"/>
+        <w:spacing w:lineRule="auto"/>
+      </w:pPr>
+      <w:r>
+        <w:rPr/>
+        <w:t xml:space="preserve">14.1 Backend — integración (node:test)</w:t>
+      </w:r>
+    </w:p>
+    <w:p>
+      <w:pPr>
+        <w:spacing w:lineRule="auto"/>
+      </w:pPr>
+      <w:r>
+        <w:rPr/>
+        <w:t xml:space="preserve">npm test</w:t>
+      </w:r>
+      <w:r>
+        <w:rPr/>
+        <w:t xml:space="preserve"> (raíz) ejecuta </w:t>
+      </w:r>
+      <w:r>
+        <w:rPr/>
+        <w:t xml:space="preserve">test/api.test.mjs</w:t>
+      </w:r>
+      <w:r>
+        <w:rPr/>
+        <w:t xml:space="preserve">: 21 pruebas que levantan la API contra la base de datos real y verifican autenticación, roles, CORS, CRUD de publicaciones, filtros de locales, validación de imágenes (magic bytes), recuperación de contraseña y la rotación/revocación de sesiones. El detalle de cada caso está en el </w:t>
+      </w:r>
+      <w:r>
+        <w:rPr>
+          <w:i/>
+        </w:rPr>
+        <w:t xml:space="preserve">Informe de Pruebas</w:t>
+      </w:r>
+      <w:r>
+        <w:rPr/>
+        <w:t xml:space="preserve">.</w:t>
+      </w:r>
+    </w:p>
+    <w:p>
+      <w:pPr>
+        <w:pStyle w:val="Heading2"/>
+        <w:spacing w:lineRule="auto"/>
+      </w:pPr>
+      <w:r>
+        <w:rPr/>
+        <w:t xml:space="preserve">14.2 Frontend — e2e (Playwright)</w:t>
+      </w:r>
+    </w:p>
+    <w:p>
+      <w:pPr>
+        <w:spacing w:lineRule="auto"/>
+      </w:pPr>
+      <w:r>
+        <w:rPr/>
+        <w:t xml:space="preserve">npm run test:e2e</w:t>
+      </w:r>
+      <w:r>
+        <w:rPr/>
+        <w:t xml:space="preserve"> (en </w:t>
+      </w:r>
+      <w:r>
+        <w:rPr/>
+        <w:t xml:space="preserve">frontend</w:t>
+      </w:r>
+      <w:r>
+        <w:rPr/>
+        <w:t xml:space="preserve">) compila el bundle de producción, levanta el backend local y el servidor de preview, y ejecuta 9 pruebas en Chromium headless: carga de la home, buscador de locales, muro, política de privacidad (con y sin extensión), rutas protegidas, registro/login/logout y el aviso en tiempo real del muro.</w:t>
+      </w:r>
+    </w:p>
+    <w:p>
+      <w:pPr>
+        <w:pStyle w:val="Heading1"/>
+        <w:spacing w:lineRule="auto"/>
+      </w:pPr>
+      <w:r>
+        <w:rPr/>
+        <w:t xml:space="preserve">15. Mejoras futuras sugeridas</w:t>
+      </w:r>
+    </w:p>
+    <w:p>
+      <w:pPr>
+        <w:numPr>
+          <w:ilvl w:val="0"/>
+          <w:numId w:val="11"/>
+        </w:numPr>
+        <w:spacing w:lineRule="auto"/>
+      </w:pPr>
+      <w:r>
+        <w:rPr/>
+        <w:t xml:space="preserve">Publicar la app en Google Play (subir el </w:t>
+      </w:r>
+      <w:r>
+        <w:rPr/>
+        <w:t xml:space="preserve">Requintu-app-release.aab</w:t>
+      </w:r>
+      <w:r>
+        <w:rPr/>
+        <w:t xml:space="preserve">, registros de la ficha, cuestionarios de contenido y datos).</w:t>
+      </w:r>
+    </w:p>
+    <w:p>
+      <w:pPr>
+        <w:numPr>
+          <w:ilvl w:val="0"/>
+          <w:numId w:val="11"/>
+        </w:numPr>
+        <w:spacing w:lineRule="auto"/>
+      </w:pPr>
+      <w:r>
+        <w:rPr/>
+        <w:t xml:space="preserve">Moderación manual de locales antes de publicarlos (flujo de aprobación).</w:t>
+      </w:r>
+    </w:p>
+    <w:p>
+      <w:pPr>
+        <w:numPr>
+          <w:ilvl w:val="0"/>
+          <w:numId w:val="11"/>
+        </w:numPr>
+        <w:spacing w:lineRule="auto"/>
+      </w:pPr>
+      <w:r>
+        <w:rPr/>
+        <w:t xml:space="preserve">Migraciones versionadas del esquema (hoy se respalda con dump).</w:t>
+      </w:r>
+    </w:p>
+    <w:p>
+      <w:pPr>
+        <w:numPr>
+          <w:ilvl w:val="0"/>
+          <w:numId w:val="11"/>
+        </w:numPr>
+        <w:spacing w:lineRule="auto"/>
+      </w:pPr>
+      <w:r>
+        <w:rPr/>
+        <w:t xml:space="preserve">Panel de la cola de correos en el admin (ver pendientes, intentos y fallidos).</w:t>
+      </w:r>
+    </w:p>
+    <w:p>
+      <w:pPr>
+        <w:numPr>
+          <w:ilvl w:val="0"/>
+          <w:numId w:val="11"/>
+        </w:numPr>
+        <w:spacing w:lineRule="auto"/>
+      </w:pPr>
+      <w:r>
+        <w:rPr/>
+        <w:t xml:space="preserve">Notificaciones push nativas (FCM) para la app Android.</w:t>
+      </w:r>
+    </w:p>
+    <w:p>
+      <w:pPr>
+        <w:pStyle w:val="Heading1"/>
+        <w:spacing w:lineRule="auto"/>
+      </w:pPr>
+      <w:r>
+        <w:rPr/>
+        <w:t xml:space="preserve">16. Glosario de rutas del servidor</w:t>
+      </w:r>
+    </w:p>
+    <w:p>
+      <w:pPr>
+        <w:numPr>
+          <w:ilvl w:val="0"/>
+          <w:numId w:val="12"/>
+        </w:numPr>
+        <w:spacing w:lineRule="auto"/>
+      </w:pPr>
+      <w:r>
+        <w:rPr/>
+        <w:t xml:space="preserve">/api/*</w:t>
+      </w:r>
+      <w:r>
+        <w:rPr/>
+        <w:t xml:space="preserve"> — API REST y canal SSE (</w:t>
+      </w:r>
+      <w:r>
+        <w:rPr/>
+        <w:t xml:space="preserve">/api/eventos</w:t>
+      </w:r>
+      <w:r>
+        <w:rPr/>
+        <w:t xml:space="preserve">).</w:t>
+      </w:r>
+    </w:p>
+    <w:p>
+      <w:pPr>
+        <w:numPr>
+          <w:ilvl w:val="0"/>
+          <w:numId w:val="12"/>
+        </w:numPr>
+        <w:spacing w:lineRule="auto"/>
+      </w:pPr>
+      <w:r>
+        <w:rPr/>
+        <w:t xml:space="preserve">/uploads/*</w:t>
+      </w:r>
+      <w:r>
+        <w:rPr/>
+        <w:t xml:space="preserve"> — archivos estáticos locales (legacy de imágenes).</w:t>
+      </w:r>
+    </w:p>
+    <w:p>
+      <w:pPr>
+        <w:numPr>
+          <w:ilvl w:val="0"/>
+          <w:numId w:val="12"/>
+        </w:numPr>
+        <w:spacing w:lineRule="auto"/>
+      </w:pPr>
+      <w:r>
+        <w:rPr/>
         <w:t xml:space="preserve">Cualquier otra ruta en web la resuelve el SPA (rewrites de Vercel/Netlify).</w:t>
       </w:r>
     </w:p>
@@ -8117,22 +9447,6 @@
     </w:p>
   </w:body>
 </w:document>
-</file>
-
-<file path=word/footer1.xml><?xml version="1.0" encoding="utf-8"?>
-<ftr xmlns="http://schemas.openxmlformats.org/wordprocessingml/2006/main">
-  <p>
-    <pPr>
-      <spacing xmlns:ns1="http://schemas.openxmlformats.org/wordprocessingml/2006/main" ns1:lineRule="auto"/>
-    </pPr>
-    <r>
-      <rPr/>
-    </r>
-    <fldSimple xmlns:ns2="http://schemas.openxmlformats.org/wordprocessingml/2006/main" ns2:instr="PAGE">
-      <r/>
-    </fldSimple>
-  </p>
-</ftr>
 </file>
 
 <file path=word/numbering.xml><?xml version="1.0" encoding="utf-8"?>
@@ -9236,6 +10550,250 @@
     </w:lvl>
   </w:abstractNum>
   <w:abstractNum w:abstractNumId="10">
+    <w:lvl w:ilvl="0">
+      <w:start w:val="1"/>
+      <w:numFmt w:val="bullet"/>
+      <w:lvlText w:val=""/>
+      <w:lvlJc w:val="left"/>
+      <w:pPr>
+        <w:tabs>
+          <w:tab w:val="num" w:pos="720"/>
+        </w:tabs>
+        <w:ind w:left="720" w:hanging="360"/>
+      </w:pPr>
+      <w:rPr>
+        <w:rFonts w:ascii="Symbol" w:hAnsi="Symbol" w:hint="default"/>
+      </w:rPr>
+    </w:lvl>
+    <w:lvl w:ilvl="1">
+      <w:start w:val="1"/>
+      <w:numFmt w:val="bullet"/>
+      <w:lvlText w:val=""/>
+      <w:lvlJc w:val="left"/>
+      <w:pPr>
+        <w:tabs>
+          <w:tab w:val="num" w:pos="1440"/>
+        </w:tabs>
+        <w:ind w:left="1440" w:hanging="360"/>
+      </w:pPr>
+      <w:rPr>
+        <w:rFonts w:ascii="Symbol" w:hAnsi="Symbol" w:hint="default"/>
+      </w:rPr>
+    </w:lvl>
+    <w:lvl w:ilvl="2">
+      <w:start w:val="1"/>
+      <w:numFmt w:val="bullet"/>
+      <w:lvlText w:val=""/>
+      <w:lvlJc w:val="left"/>
+      <w:pPr>
+        <w:tabs>
+          <w:tab w:val="num" w:pos="2160"/>
+        </w:tabs>
+        <w:ind w:left="2160" w:hanging="360"/>
+      </w:pPr>
+      <w:rPr>
+        <w:rFonts w:ascii="Symbol" w:hAnsi="Symbol" w:hint="default"/>
+      </w:rPr>
+    </w:lvl>
+    <w:lvl w:ilvl="3">
+      <w:start w:val="1"/>
+      <w:numFmt w:val="bullet"/>
+      <w:lvlText w:val=""/>
+      <w:lvlJc w:val="left"/>
+      <w:pPr>
+        <w:tabs>
+          <w:tab w:val="num" w:pos="2880"/>
+        </w:tabs>
+        <w:ind w:left="2880" w:hanging="360"/>
+      </w:pPr>
+      <w:rPr>
+        <w:rFonts w:ascii="Symbol" w:hAnsi="Symbol" w:hint="default"/>
+      </w:rPr>
+    </w:lvl>
+    <w:lvl w:ilvl="4">
+      <w:start w:val="1"/>
+      <w:numFmt w:val="bullet"/>
+      <w:lvlText w:val=""/>
+      <w:lvlJc w:val="left"/>
+      <w:pPr>
+        <w:tabs>
+          <w:tab w:val="num" w:pos="3600"/>
+        </w:tabs>
+        <w:ind w:left="3600" w:hanging="360"/>
+      </w:pPr>
+      <w:rPr>
+        <w:rFonts w:ascii="Symbol" w:hAnsi="Symbol" w:hint="default"/>
+      </w:rPr>
+    </w:lvl>
+    <w:lvl w:ilvl="5">
+      <w:start w:val="1"/>
+      <w:numFmt w:val="bullet"/>
+      <w:lvlText w:val=""/>
+      <w:lvlJc w:val="left"/>
+      <w:pPr>
+        <w:tabs>
+          <w:tab w:val="num" w:pos="4320"/>
+        </w:tabs>
+        <w:ind w:left="4320" w:hanging="360"/>
+      </w:pPr>
+      <w:rPr>
+        <w:rFonts w:ascii="Symbol" w:hAnsi="Symbol" w:hint="default"/>
+      </w:rPr>
+    </w:lvl>
+    <w:lvl w:ilvl="6">
+      <w:start w:val="1"/>
+      <w:numFmt w:val="bullet"/>
+      <w:lvlText w:val=""/>
+      <w:lvlJc w:val="left"/>
+      <w:pPr>
+        <w:tabs>
+          <w:tab w:val="num" w:pos="5040"/>
+        </w:tabs>
+        <w:ind w:left="5040" w:hanging="360"/>
+      </w:pPr>
+      <w:rPr>
+        <w:rFonts w:ascii="Symbol" w:hAnsi="Symbol" w:hint="default"/>
+      </w:rPr>
+    </w:lvl>
+    <w:lvl w:ilvl="7">
+      <w:start w:val="1"/>
+      <w:numFmt w:val="bullet"/>
+      <w:lvlText w:val=""/>
+      <w:lvlJc w:val="left"/>
+      <w:pPr>
+        <w:tabs>
+          <w:tab w:val="num" w:pos="5760"/>
+        </w:tabs>
+        <w:ind w:left="5760" w:hanging="360"/>
+      </w:pPr>
+      <w:rPr>
+        <w:rFonts w:ascii="Symbol" w:hAnsi="Symbol" w:hint="default"/>
+      </w:rPr>
+    </w:lvl>
+  </w:abstractNum>
+  <w:abstractNum w:abstractNumId="11">
+    <w:lvl w:ilvl="0">
+      <w:start w:val="1"/>
+      <w:numFmt w:val="bullet"/>
+      <w:lvlText w:val=""/>
+      <w:lvlJc w:val="left"/>
+      <w:pPr>
+        <w:tabs>
+          <w:tab w:val="num" w:pos="720"/>
+        </w:tabs>
+        <w:ind w:left="720" w:hanging="360"/>
+      </w:pPr>
+      <w:rPr>
+        <w:rFonts w:ascii="Symbol" w:hAnsi="Symbol" w:hint="default"/>
+      </w:rPr>
+    </w:lvl>
+    <w:lvl w:ilvl="1">
+      <w:start w:val="1"/>
+      <w:numFmt w:val="bullet"/>
+      <w:lvlText w:val=""/>
+      <w:lvlJc w:val="left"/>
+      <w:pPr>
+        <w:tabs>
+          <w:tab w:val="num" w:pos="1440"/>
+        </w:tabs>
+        <w:ind w:left="1440" w:hanging="360"/>
+      </w:pPr>
+      <w:rPr>
+        <w:rFonts w:ascii="Symbol" w:hAnsi="Symbol" w:hint="default"/>
+      </w:rPr>
+    </w:lvl>
+    <w:lvl w:ilvl="2">
+      <w:start w:val="1"/>
+      <w:numFmt w:val="bullet"/>
+      <w:lvlText w:val=""/>
+      <w:lvlJc w:val="left"/>
+      <w:pPr>
+        <w:tabs>
+          <w:tab w:val="num" w:pos="2160"/>
+        </w:tabs>
+        <w:ind w:left="2160" w:hanging="360"/>
+      </w:pPr>
+      <w:rPr>
+        <w:rFonts w:ascii="Symbol" w:hAnsi="Symbol" w:hint="default"/>
+      </w:rPr>
+    </w:lvl>
+    <w:lvl w:ilvl="3">
+      <w:start w:val="1"/>
+      <w:numFmt w:val="bullet"/>
+      <w:lvlText w:val=""/>
+      <w:lvlJc w:val="left"/>
+      <w:pPr>
+        <w:tabs>
+          <w:tab w:val="num" w:pos="2880"/>
+        </w:tabs>
+        <w:ind w:left="2880" w:hanging="360"/>
+      </w:pPr>
+      <w:rPr>
+        <w:rFonts w:ascii="Symbol" w:hAnsi="Symbol" w:hint="default"/>
+      </w:rPr>
+    </w:lvl>
+    <w:lvl w:ilvl="4">
+      <w:start w:val="1"/>
+      <w:numFmt w:val="bullet"/>
+      <w:lvlText w:val=""/>
+      <w:lvlJc w:val="left"/>
+      <w:pPr>
+        <w:tabs>
+          <w:tab w:val="num" w:pos="3600"/>
+        </w:tabs>
+        <w:ind w:left="3600" w:hanging="360"/>
+      </w:pPr>
+      <w:rPr>
+        <w:rFonts w:ascii="Symbol" w:hAnsi="Symbol" w:hint="default"/>
+      </w:rPr>
+    </w:lvl>
+    <w:lvl w:ilvl="5">
+      <w:start w:val="1"/>
+      <w:numFmt w:val="bullet"/>
+      <w:lvlText w:val=""/>
+      <w:lvlJc w:val="left"/>
+      <w:pPr>
+        <w:tabs>
+          <w:tab w:val="num" w:pos="4320"/>
+        </w:tabs>
+        <w:ind w:left="4320" w:hanging="360"/>
+      </w:pPr>
+      <w:rPr>
+        <w:rFonts w:ascii="Symbol" w:hAnsi="Symbol" w:hint="default"/>
+      </w:rPr>
+    </w:lvl>
+    <w:lvl w:ilvl="6">
+      <w:start w:val="1"/>
+      <w:numFmt w:val="bullet"/>
+      <w:lvlText w:val=""/>
+      <w:lvlJc w:val="left"/>
+      <w:pPr>
+        <w:tabs>
+          <w:tab w:val="num" w:pos="5040"/>
+        </w:tabs>
+        <w:ind w:left="5040" w:hanging="360"/>
+      </w:pPr>
+      <w:rPr>
+        <w:rFonts w:ascii="Symbol" w:hAnsi="Symbol" w:hint="default"/>
+      </w:rPr>
+    </w:lvl>
+    <w:lvl w:ilvl="7">
+      <w:start w:val="1"/>
+      <w:numFmt w:val="bullet"/>
+      <w:lvlText w:val=""/>
+      <w:lvlJc w:val="left"/>
+      <w:pPr>
+        <w:tabs>
+          <w:tab w:val="num" w:pos="5760"/>
+        </w:tabs>
+        <w:ind w:left="5760" w:hanging="360"/>
+      </w:pPr>
+      <w:rPr>
+        <w:rFonts w:ascii="Symbol" w:hAnsi="Symbol" w:hint="default"/>
+      </w:rPr>
+    </w:lvl>
+  </w:abstractNum>
+  <w:abstractNum w:abstractNumId="12">
     <w:lvl w:ilvl="0">
       <w:start w:val="1"/>
       <w:numFmt w:val="bullet"/>
@@ -9387,6 +10945,12 @@
   <w:num w:numId="10">
     <w:abstractNumId w:val="10"/>
   </w:num>
+  <w:num w:numId="11">
+    <w:abstractNumId w:val="11"/>
+  </w:num>
+  <w:num w:numId="12">
+    <w:abstractNumId w:val="12"/>
+  </w:num>
 </w:numbering>
 </file>
 
@@ -9395,8 +10959,8 @@
   <w:docDefaults>
     <w:rPrDefault>
       <w:rPr>
-        <w:rFonts w:ascii="Segoe UI" w:eastAsiaTheme="minorHAnsi" w:hAnsiTheme="minorHAnsi" w:cstheme="minorBidi"/>
-        <w:sz w:val="10"/>
+        <w:rFonts w:ascii="Times New Roman" w:eastAsiaTheme="minorHAnsi" w:hAnsiTheme="minorHAnsi" w:cstheme="minorBidi"/>
+        <w:sz w:val="22"/>
         <w:szCs w:val="22"/>
         <w:lang w:val="en-US" w:eastAsia="en-US" w:bidi="ar-SA"/>
       </w:rPr>
@@ -9575,13 +11139,13 @@
     </a:clrScheme>
     <a:fontScheme name="Office">
       <a:majorFont>
-        <a:latin typeface="Segoe UI"/>
-        <a:ea typeface="Segoe UI"/>
+        <a:latin typeface="Times New Roman"/>
+        <a:ea typeface="Times New Roman"/>
         <a:cs typeface=""/>
       </a:majorFont>
       <a:minorFont>
-        <a:latin typeface="Segoe UI"/>
-        <a:ea typeface="Segoe UI"/>
+        <a:latin typeface="Times New Roman"/>
+        <a:ea typeface="Times New Roman"/>
         <a:cs typeface=""/>
       </a:minorFont>
     </a:fontScheme>

</xml_diff>